<commit_message>
feat: compile combined IEEE RSL article script and foundational documentation assets
</commit_message>
<xml_diff>
--- a/project/shared/Articulo_RSL_Introduccion_y_Metodologia_IEEE.docx
+++ b/project/shared/Articulo_RSL_Introduccion_y_Metodologia_IEEE.docx
@@ -3930,7 +3930,7 @@
           <w:i w:val="0"/>
           <w:sz w:val="19"/>
         </w:rPr>
-        <w:t>4) Fase 4 (Inclusión): El corpus primario final comprende N = 131 estudios de revista científica (100% Journal Articles), distribuidos orgánicamente en 4 estudios nucleares paradigmáticos (4/4), 58 estudios de soporte avanzado (4/4), 50 estudios de soporte temático (3/4), 17 de soporte algorítmico (2/4) y 2 de contextualización (1/4).</w:t>
+        <w:t>4) Fase 4 (Inclusión): El corpus primario final comprende N = 131 estudios de revista científica (100% Journal Articles), distribuidos orgánicamente en 4 estudios nucleares paradigmáticos (4/4), 59 estudios de soporte avanzado (4/4), 49 estudios de soporte temático (3/4), 17 de soporte algorítmico (2/4) y 2 de contextualización (1/4).</w:t>
       </w:r>
     </w:p>
     <w:p>
@@ -7581,11 +7581,12 @@
         <w:tblLook w:firstColumn="1" w:firstRow="1" w:lastColumn="0" w:lastRow="0" w:noHBand="0" w:noVBand="1" w:val="04A0"/>
       </w:tblPr>
       <w:tblGrid>
-        <w:gridCol w:w="2016"/>
-        <w:gridCol w:w="2016"/>
-        <w:gridCol w:w="2016"/>
-        <w:gridCol w:w="2016"/>
-        <w:gridCol w:w="2016"/>
+        <w:gridCol w:w="1680"/>
+        <w:gridCol w:w="1680"/>
+        <w:gridCol w:w="1680"/>
+        <w:gridCol w:w="1680"/>
+        <w:gridCol w:w="1680"/>
+        <w:gridCol w:w="1680"/>
       </w:tblGrid>
       <w:tr>
         <w:trPr>
@@ -7594,7 +7595,7 @@
         </w:trPr>
         <w:tc>
           <w:tcPr>
-            <w:tcW w:type="dxa" w:w="576"/>
+            <w:tcW w:type="dxa" w:w="504"/>
             <w:shd w:fill="E8EEF5"/>
             <w:tcBorders>
               <w:top w:val="single" w:sz="4" w:space="0" w:color="CCCCCC"/>
@@ -7612,7 +7613,7 @@
               <w:rPr>
                 <w:rFonts w:ascii="Times New Roman" w:hAnsi="Times New Roman"/>
                 <w:b/>
-                <w:sz w:val="15"/>
+                <w:sz w:val="14"/>
               </w:rPr>
               <w:t>ID</w:t>
             </w:r>
@@ -7620,7 +7621,7 @@
         </w:tc>
         <w:tc>
           <w:tcPr>
-            <w:tcW w:type="dxa" w:w="1008"/>
+            <w:tcW w:type="dxa" w:w="432"/>
             <w:shd w:fill="E8EEF5"/>
             <w:tcBorders>
               <w:top w:val="single" w:sz="4" w:space="0" w:color="CCCCCC"/>
@@ -7638,7 +7639,33 @@
               <w:rPr>
                 <w:rFonts w:ascii="Times New Roman" w:hAnsi="Times New Roman"/>
                 <w:b/>
-                <w:sz w:val="15"/>
+                <w:sz w:val="14"/>
+              </w:rPr>
+              <w:t>Ref.</w:t>
+            </w:r>
+          </w:p>
+        </w:tc>
+        <w:tc>
+          <w:tcPr>
+            <w:tcW w:type="dxa" w:w="936"/>
+            <w:shd w:fill="E8EEF5"/>
+            <w:tcBorders>
+              <w:top w:val="single" w:sz="4" w:space="0" w:color="CCCCCC"/>
+              <w:bottom w:val="single" w:sz="4" w:space="0" w:color="CCCCCC"/>
+              <w:left w:val="none"/>
+              <w:right w:val="none"/>
+            </w:tcBorders>
+          </w:tcPr>
+          <w:p>
+            <w:pPr>
+              <w:spacing w:line="240" w:lineRule="auto" w:before="20" w:after="20"/>
+              <w:jc w:val="center"/>
+            </w:pPr>
+            <w:r>
+              <w:rPr>
+                <w:rFonts w:ascii="Times New Roman" w:hAnsi="Times New Roman"/>
+                <w:b/>
+                <w:sz w:val="14"/>
               </w:rPr>
               <w:t>Autores y Año</w:t>
             </w:r>
@@ -7646,7 +7673,7 @@
         </w:tc>
         <w:tc>
           <w:tcPr>
-            <w:tcW w:type="dxa" w:w="1296"/>
+            <w:tcW w:type="dxa" w:w="1224"/>
             <w:shd w:fill="E8EEF5"/>
             <w:tcBorders>
               <w:top w:val="single" w:sz="4" w:space="0" w:color="CCCCCC"/>
@@ -7664,7 +7691,7 @@
               <w:rPr>
                 <w:rFonts w:ascii="Times New Roman" w:hAnsi="Times New Roman"/>
                 <w:b/>
-                <w:sz w:val="15"/>
+                <w:sz w:val="14"/>
               </w:rPr>
               <w:t>Revista Indexada y Cuartil</w:t>
             </w:r>
@@ -7672,7 +7699,7 @@
         </w:tc>
         <w:tc>
           <w:tcPr>
-            <w:tcW w:type="dxa" w:w="864"/>
+            <w:tcW w:type="dxa" w:w="792"/>
             <w:shd w:fill="E8EEF5"/>
             <w:tcBorders>
               <w:top w:val="single" w:sz="4" w:space="0" w:color="CCCCCC"/>
@@ -7690,7 +7717,7 @@
               <w:rPr>
                 <w:rFonts w:ascii="Times New Roman" w:hAnsi="Times New Roman"/>
                 <w:b/>
-                <w:sz w:val="15"/>
+                <w:sz w:val="14"/>
               </w:rPr>
               <w:t>DOI</w:t>
             </w:r>
@@ -7698,7 +7725,7 @@
         </w:tc>
         <w:tc>
           <w:tcPr>
-            <w:tcW w:type="dxa" w:w="1152"/>
+            <w:tcW w:type="dxa" w:w="1080"/>
             <w:shd w:fill="E8EEF5"/>
             <w:tcBorders>
               <w:top w:val="single" w:sz="4" w:space="0" w:color="CCCCCC"/>
@@ -7716,7 +7743,7 @@
               <w:rPr>
                 <w:rFonts w:ascii="Times New Roman" w:hAnsi="Times New Roman"/>
                 <w:b/>
-                <w:sz w:val="15"/>
+                <w:sz w:val="14"/>
               </w:rPr>
               <w:t>Aporte Metodológico Fundamental</w:t>
             </w:r>
@@ -7729,7 +7756,7 @@
         </w:trPr>
         <w:tc>
           <w:tcPr>
-            <w:tcW w:type="dxa" w:w="576"/>
+            <w:tcW w:type="dxa" w:w="504"/>
             <w:tcBorders>
               <w:top w:val="single" w:sz="4" w:space="0" w:color="CCCCCC"/>
               <w:bottom w:val="single" w:sz="4" w:space="0" w:color="CCCCCC"/>
@@ -7745,7 +7772,7 @@
             <w:r>
               <w:rPr>
                 <w:rFonts w:ascii="Times New Roman" w:hAnsi="Times New Roman"/>
-                <w:sz w:val="15"/>
+                <w:sz w:val="14"/>
               </w:rPr>
               <w:t>[S001]</w:t>
             </w:r>
@@ -7753,7 +7780,7 @@
         </w:tc>
         <w:tc>
           <w:tcPr>
-            <w:tcW w:type="dxa" w:w="1008"/>
+            <w:tcW w:type="dxa" w:w="432"/>
             <w:tcBorders>
               <w:top w:val="single" w:sz="4" w:space="0" w:color="CCCCCC"/>
               <w:bottom w:val="single" w:sz="4" w:space="0" w:color="CCCCCC"/>
@@ -7769,7 +7796,31 @@
             <w:r>
               <w:rPr>
                 <w:rFonts w:ascii="Times New Roman" w:hAnsi="Times New Roman"/>
-                <w:sz w:val="15"/>
+                <w:sz w:val="14"/>
+              </w:rPr>
+              <w:t>[3]</w:t>
+            </w:r>
+          </w:p>
+        </w:tc>
+        <w:tc>
+          <w:tcPr>
+            <w:tcW w:type="dxa" w:w="936"/>
+            <w:tcBorders>
+              <w:top w:val="single" w:sz="4" w:space="0" w:color="CCCCCC"/>
+              <w:bottom w:val="single" w:sz="4" w:space="0" w:color="CCCCCC"/>
+              <w:left w:val="none"/>
+              <w:right w:val="none"/>
+            </w:tcBorders>
+          </w:tcPr>
+          <w:p>
+            <w:pPr>
+              <w:spacing w:line="240" w:lineRule="auto" w:before="20" w:after="20"/>
+              <w:jc w:val="left"/>
+            </w:pPr>
+            <w:r>
+              <w:rPr>
+                <w:rFonts w:ascii="Times New Roman" w:hAnsi="Times New Roman"/>
+                <w:sz w:val="14"/>
               </w:rPr>
               <w:t>Wei et al. (2026/2025)</w:t>
             </w:r>
@@ -7777,7 +7828,7 @@
         </w:tc>
         <w:tc>
           <w:tcPr>
-            <w:tcW w:type="dxa" w:w="1296"/>
+            <w:tcW w:type="dxa" w:w="1224"/>
             <w:tcBorders>
               <w:top w:val="single" w:sz="4" w:space="0" w:color="CCCCCC"/>
               <w:bottom w:val="single" w:sz="4" w:space="0" w:color="CCCCCC"/>
@@ -7793,7 +7844,7 @@
             <w:r>
               <w:rPr>
                 <w:rFonts w:ascii="Times New Roman" w:hAnsi="Times New Roman"/>
-                <w:sz w:val="15"/>
+                <w:sz w:val="14"/>
               </w:rPr>
               <w:t>Pattern Recognition (Elsevier, Q1)</w:t>
             </w:r>
@@ -7801,7 +7852,7 @@
         </w:tc>
         <w:tc>
           <w:tcPr>
-            <w:tcW w:type="dxa" w:w="864"/>
+            <w:tcW w:type="dxa" w:w="792"/>
             <w:tcBorders>
               <w:top w:val="single" w:sz="4" w:space="0" w:color="CCCCCC"/>
               <w:bottom w:val="single" w:sz="4" w:space="0" w:color="CCCCCC"/>
@@ -7817,7 +7868,7 @@
             <w:r>
               <w:rPr>
                 <w:rFonts w:ascii="Times New Roman" w:hAnsi="Times New Roman"/>
-                <w:sz w:val="15"/>
+                <w:sz w:val="14"/>
               </w:rPr>
               <w:t>10.1016/j.patcog.2025.112348</w:t>
             </w:r>
@@ -7825,7 +7876,7 @@
         </w:tc>
         <w:tc>
           <w:tcPr>
-            <w:tcW w:type="dxa" w:w="1152"/>
+            <w:tcW w:type="dxa" w:w="1080"/>
             <w:tcBorders>
               <w:top w:val="single" w:sz="4" w:space="0" w:color="CCCCCC"/>
               <w:bottom w:val="single" w:sz="4" w:space="0" w:color="CCCCCC"/>
@@ -7841,7 +7892,7 @@
             <w:r>
               <w:rPr>
                 <w:rFonts w:ascii="Times New Roman" w:hAnsi="Times New Roman"/>
-                <w:sz w:val="15"/>
+                <w:sz w:val="14"/>
               </w:rPr>
               <w:t>VLM multimodal para QA visual sobre gráficos y tablas complejas, superando baselines de OCR tradicional.</w:t>
             </w:r>
@@ -7854,7 +7905,7 @@
         </w:trPr>
         <w:tc>
           <w:tcPr>
-            <w:tcW w:type="dxa" w:w="576"/>
+            <w:tcW w:type="dxa" w:w="504"/>
             <w:tcBorders>
               <w:top w:val="single" w:sz="4" w:space="0" w:color="CCCCCC"/>
               <w:bottom w:val="single" w:sz="4" w:space="0" w:color="CCCCCC"/>
@@ -7870,7 +7921,7 @@
             <w:r>
               <w:rPr>
                 <w:rFonts w:ascii="Times New Roman" w:hAnsi="Times New Roman"/>
-                <w:sz w:val="15"/>
+                <w:sz w:val="14"/>
               </w:rPr>
               <w:t>[S002]</w:t>
             </w:r>
@@ -7878,7 +7929,7 @@
         </w:tc>
         <w:tc>
           <w:tcPr>
-            <w:tcW w:type="dxa" w:w="1008"/>
+            <w:tcW w:type="dxa" w:w="432"/>
             <w:tcBorders>
               <w:top w:val="single" w:sz="4" w:space="0" w:color="CCCCCC"/>
               <w:bottom w:val="single" w:sz="4" w:space="0" w:color="CCCCCC"/>
@@ -7894,7 +7945,31 @@
             <w:r>
               <w:rPr>
                 <w:rFonts w:ascii="Times New Roman" w:hAnsi="Times New Roman"/>
-                <w:sz w:val="15"/>
+                <w:sz w:val="14"/>
+              </w:rPr>
+              <w:t>[4]</w:t>
+            </w:r>
+          </w:p>
+        </w:tc>
+        <w:tc>
+          <w:tcPr>
+            <w:tcW w:type="dxa" w:w="936"/>
+            <w:tcBorders>
+              <w:top w:val="single" w:sz="4" w:space="0" w:color="CCCCCC"/>
+              <w:bottom w:val="single" w:sz="4" w:space="0" w:color="CCCCCC"/>
+              <w:left w:val="none"/>
+              <w:right w:val="none"/>
+            </w:tcBorders>
+          </w:tcPr>
+          <w:p>
+            <w:pPr>
+              <w:spacing w:line="240" w:lineRule="auto" w:before="20" w:after="20"/>
+              <w:jc w:val="left"/>
+            </w:pPr>
+            <w:r>
+              <w:rPr>
+                <w:rFonts w:ascii="Times New Roman" w:hAnsi="Times New Roman"/>
+                <w:sz w:val="14"/>
               </w:rPr>
               <w:t>Chen et al. (2025)</w:t>
             </w:r>
@@ -7902,7 +7977,7 @@
         </w:tc>
         <w:tc>
           <w:tcPr>
-            <w:tcW w:type="dxa" w:w="1296"/>
+            <w:tcW w:type="dxa" w:w="1224"/>
             <w:tcBorders>
               <w:top w:val="single" w:sz="4" w:space="0" w:color="CCCCCC"/>
               <w:bottom w:val="single" w:sz="4" w:space="0" w:color="CCCCCC"/>
@@ -7918,7 +7993,7 @@
             <w:r>
               <w:rPr>
                 <w:rFonts w:ascii="Times New Roman" w:hAnsi="Times New Roman"/>
-                <w:sz w:val="15"/>
+                <w:sz w:val="14"/>
               </w:rPr>
               <w:t>Electronics (MDPI, Q2)</w:t>
             </w:r>
@@ -7926,7 +8001,7 @@
         </w:tc>
         <w:tc>
           <w:tcPr>
-            <w:tcW w:type="dxa" w:w="864"/>
+            <w:tcW w:type="dxa" w:w="792"/>
             <w:tcBorders>
               <w:top w:val="single" w:sz="4" w:space="0" w:color="CCCCCC"/>
               <w:bottom w:val="single" w:sz="4" w:space="0" w:color="CCCCCC"/>
@@ -7942,7 +8017,7 @@
             <w:r>
               <w:rPr>
                 <w:rFonts w:ascii="Times New Roman" w:hAnsi="Times New Roman"/>
-                <w:sz w:val="15"/>
+                <w:sz w:val="14"/>
               </w:rPr>
               <w:t>10.3390/electronics14112145</w:t>
             </w:r>
@@ -7950,7 +8025,7 @@
         </w:tc>
         <w:tc>
           <w:tcPr>
-            <w:tcW w:type="dxa" w:w="1152"/>
+            <w:tcW w:type="dxa" w:w="1080"/>
             <w:tcBorders>
               <w:top w:val="single" w:sz="4" w:space="0" w:color="CCCCCC"/>
               <w:bottom w:val="single" w:sz="4" w:space="0" w:color="CCCCCC"/>
@@ -7966,7 +8041,7 @@
             <w:r>
               <w:rPr>
                 <w:rFonts w:ascii="Times New Roman" w:hAnsi="Times New Roman"/>
-                <w:sz w:val="15"/>
+                <w:sz w:val="14"/>
               </w:rPr>
               <w:t>Evaluación rigurosa de LLMs e ingeniería de prompts en extracción de información documental frente a reglas fijas.</w:t>
             </w:r>
@@ -7979,7 +8054,7 @@
         </w:trPr>
         <w:tc>
           <w:tcPr>
-            <w:tcW w:type="dxa" w:w="576"/>
+            <w:tcW w:type="dxa" w:w="504"/>
             <w:tcBorders>
               <w:top w:val="single" w:sz="4" w:space="0" w:color="CCCCCC"/>
               <w:bottom w:val="single" w:sz="4" w:space="0" w:color="CCCCCC"/>
@@ -7995,7 +8070,7 @@
             <w:r>
               <w:rPr>
                 <w:rFonts w:ascii="Times New Roman" w:hAnsi="Times New Roman"/>
-                <w:sz w:val="15"/>
+                <w:sz w:val="14"/>
               </w:rPr>
               <w:t>[S003]</w:t>
             </w:r>
@@ -8003,7 +8078,7 @@
         </w:tc>
         <w:tc>
           <w:tcPr>
-            <w:tcW w:type="dxa" w:w="1008"/>
+            <w:tcW w:type="dxa" w:w="432"/>
             <w:tcBorders>
               <w:top w:val="single" w:sz="4" w:space="0" w:color="CCCCCC"/>
               <w:bottom w:val="single" w:sz="4" w:space="0" w:color="CCCCCC"/>
@@ -8019,7 +8094,31 @@
             <w:r>
               <w:rPr>
                 <w:rFonts w:ascii="Times New Roman" w:hAnsi="Times New Roman"/>
-                <w:sz w:val="15"/>
+                <w:sz w:val="14"/>
+              </w:rPr>
+              <w:t>[5]</w:t>
+            </w:r>
+          </w:p>
+        </w:tc>
+        <w:tc>
+          <w:tcPr>
+            <w:tcW w:type="dxa" w:w="936"/>
+            <w:tcBorders>
+              <w:top w:val="single" w:sz="4" w:space="0" w:color="CCCCCC"/>
+              <w:bottom w:val="single" w:sz="4" w:space="0" w:color="CCCCCC"/>
+              <w:left w:val="none"/>
+              <w:right w:val="none"/>
+            </w:tcBorders>
+          </w:tcPr>
+          <w:p>
+            <w:pPr>
+              <w:spacing w:line="240" w:lineRule="auto" w:before="20" w:after="20"/>
+              <w:jc w:val="left"/>
+            </w:pPr>
+            <w:r>
+              <w:rPr>
+                <w:rFonts w:ascii="Times New Roman" w:hAnsi="Times New Roman"/>
+                <w:sz w:val="14"/>
               </w:rPr>
               <w:t>Ali Khandokar &amp; Deshpande (2025)</w:t>
             </w:r>
@@ -8027,7 +8126,7 @@
         </w:tc>
         <w:tc>
           <w:tcPr>
-            <w:tcW w:type="dxa" w:w="1296"/>
+            <w:tcW w:type="dxa" w:w="1224"/>
             <w:tcBorders>
               <w:top w:val="single" w:sz="4" w:space="0" w:color="CCCCCC"/>
               <w:bottom w:val="single" w:sz="4" w:space="0" w:color="CCCCCC"/>
@@ -8043,7 +8142,7 @@
             <w:r>
               <w:rPr>
                 <w:rFonts w:ascii="Times New Roman" w:hAnsi="Times New Roman"/>
-                <w:sz w:val="15"/>
+                <w:sz w:val="14"/>
               </w:rPr>
               <w:t>IEEE Access (IEEE, Q1)</w:t>
             </w:r>
@@ -8051,7 +8150,7 @@
         </w:tc>
         <w:tc>
           <w:tcPr>
-            <w:tcW w:type="dxa" w:w="864"/>
+            <w:tcW w:type="dxa" w:w="792"/>
             <w:tcBorders>
               <w:top w:val="single" w:sz="4" w:space="0" w:color="CCCCCC"/>
               <w:bottom w:val="single" w:sz="4" w:space="0" w:color="CCCCCC"/>
@@ -8067,7 +8166,7 @@
             <w:r>
               <w:rPr>
                 <w:rFonts w:ascii="Times New Roman" w:hAnsi="Times New Roman"/>
-                <w:sz w:val="15"/>
+                <w:sz w:val="14"/>
               </w:rPr>
               <w:t>10.1109/access.2024.3522141</w:t>
             </w:r>
@@ -8075,7 +8174,7 @@
         </w:tc>
         <w:tc>
           <w:tcPr>
-            <w:tcW w:type="dxa" w:w="1152"/>
+            <w:tcW w:type="dxa" w:w="1080"/>
             <w:tcBorders>
               <w:top w:val="single" w:sz="4" w:space="0" w:color="CCCCCC"/>
               <w:bottom w:val="single" w:sz="4" w:space="0" w:color="CCCCCC"/>
@@ -8091,7 +8190,7 @@
             <w:r>
               <w:rPr>
                 <w:rFonts w:ascii="Times New Roman" w:hAnsi="Times New Roman"/>
-                <w:sz w:val="15"/>
+                <w:sz w:val="14"/>
               </w:rPr>
               <w:t>Pipeline de visión computacional y deep learning para extracción de tablas financieras heterogéneas sin plantillas.</w:t>
             </w:r>
@@ -8104,7 +8203,7 @@
         </w:trPr>
         <w:tc>
           <w:tcPr>
-            <w:tcW w:type="dxa" w:w="576"/>
+            <w:tcW w:type="dxa" w:w="504"/>
             <w:tcBorders>
               <w:top w:val="single" w:sz="4" w:space="0" w:color="CCCCCC"/>
               <w:bottom w:val="single" w:sz="4" w:space="0" w:color="CCCCCC"/>
@@ -8120,7 +8219,7 @@
             <w:r>
               <w:rPr>
                 <w:rFonts w:ascii="Times New Roman" w:hAnsi="Times New Roman"/>
-                <w:sz w:val="15"/>
+                <w:sz w:val="14"/>
               </w:rPr>
               <w:t>[S004]</w:t>
             </w:r>
@@ -8128,7 +8227,7 @@
         </w:tc>
         <w:tc>
           <w:tcPr>
-            <w:tcW w:type="dxa" w:w="1008"/>
+            <w:tcW w:type="dxa" w:w="432"/>
             <w:tcBorders>
               <w:top w:val="single" w:sz="4" w:space="0" w:color="CCCCCC"/>
               <w:bottom w:val="single" w:sz="4" w:space="0" w:color="CCCCCC"/>
@@ -8144,7 +8243,31 @@
             <w:r>
               <w:rPr>
                 <w:rFonts w:ascii="Times New Roman" w:hAnsi="Times New Roman"/>
-                <w:sz w:val="15"/>
+                <w:sz w:val="14"/>
+              </w:rPr>
+              <w:t>[6]</w:t>
+            </w:r>
+          </w:p>
+        </w:tc>
+        <w:tc>
+          <w:tcPr>
+            <w:tcW w:type="dxa" w:w="936"/>
+            <w:tcBorders>
+              <w:top w:val="single" w:sz="4" w:space="0" w:color="CCCCCC"/>
+              <w:bottom w:val="single" w:sz="4" w:space="0" w:color="CCCCCC"/>
+              <w:left w:val="none"/>
+              <w:right w:val="none"/>
+            </w:tcBorders>
+          </w:tcPr>
+          <w:p>
+            <w:pPr>
+              <w:spacing w:line="240" w:lineRule="auto" w:before="20" w:after="20"/>
+              <w:jc w:val="left"/>
+            </w:pPr>
+            <w:r>
+              <w:rPr>
+                <w:rFonts w:ascii="Times New Roman" w:hAnsi="Times New Roman"/>
+                <w:sz w:val="14"/>
               </w:rPr>
               <w:t>Mifsud et al. (2025)</w:t>
             </w:r>
@@ -8152,7 +8275,7 @@
         </w:tc>
         <w:tc>
           <w:tcPr>
-            <w:tcW w:type="dxa" w:w="1296"/>
+            <w:tcW w:type="dxa" w:w="1224"/>
             <w:tcBorders>
               <w:top w:val="single" w:sz="4" w:space="0" w:color="CCCCCC"/>
               <w:bottom w:val="single" w:sz="4" w:space="0" w:color="CCCCCC"/>
@@ -8168,7 +8291,7 @@
             <w:r>
               <w:rPr>
                 <w:rFonts w:ascii="Times New Roman" w:hAnsi="Times New Roman"/>
-                <w:sz w:val="15"/>
+                <w:sz w:val="14"/>
               </w:rPr>
               <w:t>Mach. Learn. Knowl. Extr. (MDPI, Q2)</w:t>
             </w:r>
@@ -8176,7 +8299,7 @@
         </w:tc>
         <w:tc>
           <w:tcPr>
-            <w:tcW w:type="dxa" w:w="864"/>
+            <w:tcW w:type="dxa" w:w="792"/>
             <w:tcBorders>
               <w:top w:val="single" w:sz="4" w:space="0" w:color="CCCCCC"/>
               <w:bottom w:val="single" w:sz="4" w:space="0" w:color="CCCCCC"/>
@@ -8192,7 +8315,7 @@
             <w:r>
               <w:rPr>
                 <w:rFonts w:ascii="Times New Roman" w:hAnsi="Times New Roman"/>
-                <w:sz w:val="15"/>
+                <w:sz w:val="14"/>
               </w:rPr>
               <w:t>10.3390/make7040167</w:t>
             </w:r>
@@ -8200,7 +8323,7 @@
         </w:tc>
         <w:tc>
           <w:tcPr>
-            <w:tcW w:type="dxa" w:w="1152"/>
+            <w:tcW w:type="dxa" w:w="1080"/>
             <w:tcBorders>
               <w:top w:val="single" w:sz="4" w:space="0" w:color="CCCCCC"/>
               <w:bottom w:val="single" w:sz="4" w:space="0" w:color="CCCCCC"/>
@@ -8216,7 +8339,7 @@
             <w:r>
               <w:rPr>
                 <w:rFonts w:ascii="Times New Roman" w:hAnsi="Times New Roman"/>
-                <w:sz w:val="15"/>
+                <w:sz w:val="14"/>
               </w:rPr>
               <w:t>Modelo híbrido que combina y contrasta Transformers multimodales con sistemas basados en reglas en recibos comerciales.</w:t>
             </w:r>
@@ -8251,7 +8374,7 @@
           <w:i w:val="0"/>
           <w:sz w:val="19"/>
         </w:rPr>
-        <w:t>El corpus de N = 131 estudios primarios se clasificó mediante una evaluación semántica directa sobre sus variables empíricas: Nucleares (n = 4), Soporte Temático Avanzado (n = 108), Soporte Algorítmico y de Rendimiento (n = 17) y Contextualización (n = 2). La Tabla X presenta una muestra representativa de 11 estudios a lo largo de los estratos:</w:t>
+        <w:t>El corpus de N = 131 estudios primarios se clasificó mediante una evaluación semántica directa sobre sus variables empíricas: Nucleares (n = 4), Soporte Temático Avanzado (n = 108), Soporte Algorítmico y de Rendimiento (n = 17) y Contextualización (n = 2). La relación biunívoca matemática entre el identificador del corpus [Sxxx] y la cita IEEE [n] está regida estrictamente por Ref IEEE [n] = ID S + 2 (dado que las citas [1] y [2] corresponden a las normas metodológicas marco Kitchenham &amp; Charters y PRISMA 2020). La Tabla X presenta una muestra representativa de 11 estudios a lo largo de los estratos evidenciando esta correspondencia perfecta:</w:t>
       </w:r>
     </w:p>
     <w:p>
@@ -8284,14 +8407,15 @@
         <w:tblLook w:firstColumn="1" w:firstRow="1" w:lastColumn="0" w:lastRow="0" w:noHBand="0" w:noVBand="1" w:val="04A0"/>
       </w:tblPr>
       <w:tblGrid>
-        <w:gridCol w:w="1260"/>
-        <w:gridCol w:w="1260"/>
-        <w:gridCol w:w="1260"/>
-        <w:gridCol w:w="1260"/>
-        <w:gridCol w:w="1260"/>
-        <w:gridCol w:w="1260"/>
-        <w:gridCol w:w="1260"/>
-        <w:gridCol w:w="1260"/>
+        <w:gridCol w:w="1120"/>
+        <w:gridCol w:w="1120"/>
+        <w:gridCol w:w="1120"/>
+        <w:gridCol w:w="1120"/>
+        <w:gridCol w:w="1120"/>
+        <w:gridCol w:w="1120"/>
+        <w:gridCol w:w="1120"/>
+        <w:gridCol w:w="1120"/>
+        <w:gridCol w:w="1120"/>
       </w:tblGrid>
       <w:tr>
         <w:trPr>
@@ -8300,7 +8424,7 @@
         </w:trPr>
         <w:tc>
           <w:tcPr>
-            <w:tcW w:type="dxa" w:w="576"/>
+            <w:tcW w:type="dxa" w:w="504"/>
             <w:shd w:fill="E8EEF5"/>
             <w:tcBorders>
               <w:top w:val="single" w:sz="4" w:space="0" w:color="CCCCCC"/>
@@ -8318,7 +8442,7 @@
               <w:rPr>
                 <w:rFonts w:ascii="Times New Roman" w:hAnsi="Times New Roman"/>
                 <w:b/>
-                <w:sz w:val="15"/>
+                <w:sz w:val="14"/>
               </w:rPr>
               <w:t>ID</w:t>
             </w:r>
@@ -8326,7 +8450,7 @@
         </w:tc>
         <w:tc>
           <w:tcPr>
-            <w:tcW w:type="dxa" w:w="1584"/>
+            <w:tcW w:type="dxa" w:w="432"/>
             <w:shd w:fill="E8EEF5"/>
             <w:tcBorders>
               <w:top w:val="single" w:sz="4" w:space="0" w:color="CCCCCC"/>
@@ -8344,7 +8468,33 @@
               <w:rPr>
                 <w:rFonts w:ascii="Times New Roman" w:hAnsi="Times New Roman"/>
                 <w:b/>
-                <w:sz w:val="15"/>
+                <w:sz w:val="14"/>
+              </w:rPr>
+              <w:t>Ref.</w:t>
+            </w:r>
+          </w:p>
+        </w:tc>
+        <w:tc>
+          <w:tcPr>
+            <w:tcW w:type="dxa" w:w="1440"/>
+            <w:shd w:fill="E8EEF5"/>
+            <w:tcBorders>
+              <w:top w:val="single" w:sz="4" w:space="0" w:color="CCCCCC"/>
+              <w:bottom w:val="single" w:sz="4" w:space="0" w:color="CCCCCC"/>
+              <w:left w:val="none"/>
+              <w:right w:val="none"/>
+            </w:tcBorders>
+          </w:tcPr>
+          <w:p>
+            <w:pPr>
+              <w:spacing w:line="240" w:lineRule="auto" w:before="20" w:after="20"/>
+              <w:jc w:val="center"/>
+            </w:pPr>
+            <w:r>
+              <w:rPr>
+                <w:rFonts w:ascii="Times New Roman" w:hAnsi="Times New Roman"/>
+                <w:b/>
+                <w:sz w:val="14"/>
               </w:rPr>
               <w:t>Autores (Año)</w:t>
             </w:r>
@@ -8370,7 +8520,7 @@
               <w:rPr>
                 <w:rFonts w:ascii="Times New Roman" w:hAnsi="Times New Roman"/>
                 <w:b/>
-                <w:sz w:val="15"/>
+                <w:sz w:val="14"/>
               </w:rPr>
               <w:t>PI1</w:t>
             </w:r>
@@ -8396,7 +8546,7 @@
               <w:rPr>
                 <w:rFonts w:ascii="Times New Roman" w:hAnsi="Times New Roman"/>
                 <w:b/>
-                <w:sz w:val="15"/>
+                <w:sz w:val="14"/>
               </w:rPr>
               <w:t>PI2</w:t>
             </w:r>
@@ -8422,7 +8572,7 @@
               <w:rPr>
                 <w:rFonts w:ascii="Times New Roman" w:hAnsi="Times New Roman"/>
                 <w:b/>
-                <w:sz w:val="15"/>
+                <w:sz w:val="14"/>
               </w:rPr>
               <w:t>PI3</w:t>
             </w:r>
@@ -8448,7 +8598,7 @@
               <w:rPr>
                 <w:rFonts w:ascii="Times New Roman" w:hAnsi="Times New Roman"/>
                 <w:b/>
-                <w:sz w:val="15"/>
+                <w:sz w:val="14"/>
               </w:rPr>
               <w:t>PI4</w:t>
             </w:r>
@@ -8474,7 +8624,7 @@
               <w:rPr>
                 <w:rFonts w:ascii="Times New Roman" w:hAnsi="Times New Roman"/>
                 <w:b/>
-                <w:sz w:val="15"/>
+                <w:sz w:val="14"/>
               </w:rPr>
               <w:t>Total</w:t>
             </w:r>
@@ -8482,7 +8632,7 @@
         </w:tc>
         <w:tc>
           <w:tcPr>
-            <w:tcW w:type="dxa" w:w="1152"/>
+            <w:tcW w:type="dxa" w:w="1008"/>
             <w:shd w:fill="E8EEF5"/>
             <w:tcBorders>
               <w:top w:val="single" w:sz="4" w:space="0" w:color="CCCCCC"/>
@@ -8500,7 +8650,7 @@
               <w:rPr>
                 <w:rFonts w:ascii="Times New Roman" w:hAnsi="Times New Roman"/>
                 <w:b/>
-                <w:sz w:val="15"/>
+                <w:sz w:val="14"/>
               </w:rPr>
               <w:t>Estrato de Evidencia</w:t>
             </w:r>
@@ -8513,7 +8663,7 @@
         </w:trPr>
         <w:tc>
           <w:tcPr>
-            <w:tcW w:type="dxa" w:w="576"/>
+            <w:tcW w:type="dxa" w:w="504"/>
             <w:tcBorders>
               <w:top w:val="single" w:sz="4" w:space="0" w:color="CCCCCC"/>
               <w:bottom w:val="single" w:sz="4" w:space="0" w:color="CCCCCC"/>
@@ -8529,7 +8679,7 @@
             <w:r>
               <w:rPr>
                 <w:rFonts w:ascii="Times New Roman" w:hAnsi="Times New Roman"/>
-                <w:sz w:val="15"/>
+                <w:sz w:val="14"/>
               </w:rPr>
               <w:t>[S001]</w:t>
             </w:r>
@@ -8537,7 +8687,31 @@
         </w:tc>
         <w:tc>
           <w:tcPr>
-            <w:tcW w:type="dxa" w:w="1584"/>
+            <w:tcW w:type="dxa" w:w="432"/>
+            <w:tcBorders>
+              <w:top w:val="single" w:sz="4" w:space="0" w:color="CCCCCC"/>
+              <w:bottom w:val="single" w:sz="4" w:space="0" w:color="CCCCCC"/>
+              <w:left w:val="none"/>
+              <w:right w:val="none"/>
+            </w:tcBorders>
+          </w:tcPr>
+          <w:p>
+            <w:pPr>
+              <w:spacing w:line="240" w:lineRule="auto" w:before="20" w:after="20"/>
+              <w:jc w:val="center"/>
+            </w:pPr>
+            <w:r>
+              <w:rPr>
+                <w:rFonts w:ascii="Times New Roman" w:hAnsi="Times New Roman"/>
+                <w:sz w:val="14"/>
+              </w:rPr>
+              <w:t>[3]</w:t>
+            </w:r>
+          </w:p>
+        </w:tc>
+        <w:tc>
+          <w:tcPr>
+            <w:tcW w:type="dxa" w:w="1440"/>
             <w:tcBorders>
               <w:top w:val="single" w:sz="4" w:space="0" w:color="CCCCCC"/>
               <w:bottom w:val="single" w:sz="4" w:space="0" w:color="CCCCCC"/>
@@ -8553,7 +8727,7 @@
             <w:r>
               <w:rPr>
                 <w:rFonts w:ascii="Times New Roman" w:hAnsi="Times New Roman"/>
-                <w:sz w:val="15"/>
+                <w:sz w:val="14"/>
               </w:rPr>
               <w:t>Wei, JX et al. (2026)</w:t>
             </w:r>
@@ -8577,7 +8751,7 @@
             <w:r>
               <w:rPr>
                 <w:rFonts w:ascii="Times New Roman" w:hAnsi="Times New Roman"/>
-                <w:sz w:val="15"/>
+                <w:sz w:val="14"/>
               </w:rPr>
               <w:t>✔</w:t>
             </w:r>
@@ -8601,7 +8775,7 @@
             <w:r>
               <w:rPr>
                 <w:rFonts w:ascii="Times New Roman" w:hAnsi="Times New Roman"/>
-                <w:sz w:val="15"/>
+                <w:sz w:val="14"/>
               </w:rPr>
               <w:t>✔</w:t>
             </w:r>
@@ -8625,7 +8799,7 @@
             <w:r>
               <w:rPr>
                 <w:rFonts w:ascii="Times New Roman" w:hAnsi="Times New Roman"/>
-                <w:sz w:val="15"/>
+                <w:sz w:val="14"/>
               </w:rPr>
               <w:t>✔</w:t>
             </w:r>
@@ -8649,7 +8823,7 @@
             <w:r>
               <w:rPr>
                 <w:rFonts w:ascii="Times New Roman" w:hAnsi="Times New Roman"/>
-                <w:sz w:val="15"/>
+                <w:sz w:val="14"/>
               </w:rPr>
               <w:t>✔</w:t>
             </w:r>
@@ -8673,7 +8847,7 @@
             <w:r>
               <w:rPr>
                 <w:rFonts w:ascii="Times New Roman" w:hAnsi="Times New Roman"/>
-                <w:sz w:val="15"/>
+                <w:sz w:val="14"/>
               </w:rPr>
               <w:t>4/4</w:t>
             </w:r>
@@ -8681,7 +8855,7 @@
         </w:tc>
         <w:tc>
           <w:tcPr>
-            <w:tcW w:type="dxa" w:w="1152"/>
+            <w:tcW w:type="dxa" w:w="1008"/>
             <w:tcBorders>
               <w:top w:val="single" w:sz="4" w:space="0" w:color="CCCCCC"/>
               <w:bottom w:val="single" w:sz="4" w:space="0" w:color="CCCCCC"/>
@@ -8697,7 +8871,7 @@
             <w:r>
               <w:rPr>
                 <w:rFonts w:ascii="Times New Roman" w:hAnsi="Times New Roman"/>
-                <w:sz w:val="15"/>
+                <w:sz w:val="14"/>
               </w:rPr>
               <w:t>Nuclear</w:t>
             </w:r>
@@ -8710,7 +8884,7 @@
         </w:trPr>
         <w:tc>
           <w:tcPr>
-            <w:tcW w:type="dxa" w:w="576"/>
+            <w:tcW w:type="dxa" w:w="504"/>
             <w:tcBorders>
               <w:top w:val="single" w:sz="4" w:space="0" w:color="CCCCCC"/>
               <w:bottom w:val="single" w:sz="4" w:space="0" w:color="CCCCCC"/>
@@ -8726,7 +8900,7 @@
             <w:r>
               <w:rPr>
                 <w:rFonts w:ascii="Times New Roman" w:hAnsi="Times New Roman"/>
-                <w:sz w:val="15"/>
+                <w:sz w:val="14"/>
               </w:rPr>
               <w:t>[S002]</w:t>
             </w:r>
@@ -8734,7 +8908,31 @@
         </w:tc>
         <w:tc>
           <w:tcPr>
-            <w:tcW w:type="dxa" w:w="1584"/>
+            <w:tcW w:type="dxa" w:w="432"/>
+            <w:tcBorders>
+              <w:top w:val="single" w:sz="4" w:space="0" w:color="CCCCCC"/>
+              <w:bottom w:val="single" w:sz="4" w:space="0" w:color="CCCCCC"/>
+              <w:left w:val="none"/>
+              <w:right w:val="none"/>
+            </w:tcBorders>
+          </w:tcPr>
+          <w:p>
+            <w:pPr>
+              <w:spacing w:line="240" w:lineRule="auto" w:before="20" w:after="20"/>
+              <w:jc w:val="center"/>
+            </w:pPr>
+            <w:r>
+              <w:rPr>
+                <w:rFonts w:ascii="Times New Roman" w:hAnsi="Times New Roman"/>
+                <w:sz w:val="14"/>
+              </w:rPr>
+              <w:t>[4]</w:t>
+            </w:r>
+          </w:p>
+        </w:tc>
+        <w:tc>
+          <w:tcPr>
+            <w:tcW w:type="dxa" w:w="1440"/>
             <w:tcBorders>
               <w:top w:val="single" w:sz="4" w:space="0" w:color="CCCCCC"/>
               <w:bottom w:val="single" w:sz="4" w:space="0" w:color="CCCCCC"/>
@@ -8750,7 +8948,7 @@
             <w:r>
               <w:rPr>
                 <w:rFonts w:ascii="Times New Roman" w:hAnsi="Times New Roman"/>
-                <w:sz w:val="15"/>
+                <w:sz w:val="14"/>
               </w:rPr>
               <w:t>Chen L.-C. et al. (2025)</w:t>
             </w:r>
@@ -8774,7 +8972,7 @@
             <w:r>
               <w:rPr>
                 <w:rFonts w:ascii="Times New Roman" w:hAnsi="Times New Roman"/>
-                <w:sz w:val="15"/>
+                <w:sz w:val="14"/>
               </w:rPr>
               <w:t>✔</w:t>
             </w:r>
@@ -8798,7 +8996,7 @@
             <w:r>
               <w:rPr>
                 <w:rFonts w:ascii="Times New Roman" w:hAnsi="Times New Roman"/>
-                <w:sz w:val="15"/>
+                <w:sz w:val="14"/>
               </w:rPr>
               <w:t>✔</w:t>
             </w:r>
@@ -8822,7 +9020,7 @@
             <w:r>
               <w:rPr>
                 <w:rFonts w:ascii="Times New Roman" w:hAnsi="Times New Roman"/>
-                <w:sz w:val="15"/>
+                <w:sz w:val="14"/>
               </w:rPr>
               <w:t>✔</w:t>
             </w:r>
@@ -8846,7 +9044,7 @@
             <w:r>
               <w:rPr>
                 <w:rFonts w:ascii="Times New Roman" w:hAnsi="Times New Roman"/>
-                <w:sz w:val="15"/>
+                <w:sz w:val="14"/>
               </w:rPr>
               <w:t>✔</w:t>
             </w:r>
@@ -8870,7 +9068,7 @@
             <w:r>
               <w:rPr>
                 <w:rFonts w:ascii="Times New Roman" w:hAnsi="Times New Roman"/>
-                <w:sz w:val="15"/>
+                <w:sz w:val="14"/>
               </w:rPr>
               <w:t>4/4</w:t>
             </w:r>
@@ -8878,7 +9076,7 @@
         </w:tc>
         <w:tc>
           <w:tcPr>
-            <w:tcW w:type="dxa" w:w="1152"/>
+            <w:tcW w:type="dxa" w:w="1008"/>
             <w:tcBorders>
               <w:top w:val="single" w:sz="4" w:space="0" w:color="CCCCCC"/>
               <w:bottom w:val="single" w:sz="4" w:space="0" w:color="CCCCCC"/>
@@ -8894,7 +9092,7 @@
             <w:r>
               <w:rPr>
                 <w:rFonts w:ascii="Times New Roman" w:hAnsi="Times New Roman"/>
-                <w:sz w:val="15"/>
+                <w:sz w:val="14"/>
               </w:rPr>
               <w:t>Nuclear</w:t>
             </w:r>
@@ -8907,7 +9105,7 @@
         </w:trPr>
         <w:tc>
           <w:tcPr>
-            <w:tcW w:type="dxa" w:w="576"/>
+            <w:tcW w:type="dxa" w:w="504"/>
             <w:tcBorders>
               <w:top w:val="single" w:sz="4" w:space="0" w:color="CCCCCC"/>
               <w:bottom w:val="single" w:sz="4" w:space="0" w:color="CCCCCC"/>
@@ -8923,7 +9121,7 @@
             <w:r>
               <w:rPr>
                 <w:rFonts w:ascii="Times New Roman" w:hAnsi="Times New Roman"/>
-                <w:sz w:val="15"/>
+                <w:sz w:val="14"/>
               </w:rPr>
               <w:t>[S003]</w:t>
             </w:r>
@@ -8931,7 +9129,31 @@
         </w:tc>
         <w:tc>
           <w:tcPr>
-            <w:tcW w:type="dxa" w:w="1584"/>
+            <w:tcW w:type="dxa" w:w="432"/>
+            <w:tcBorders>
+              <w:top w:val="single" w:sz="4" w:space="0" w:color="CCCCCC"/>
+              <w:bottom w:val="single" w:sz="4" w:space="0" w:color="CCCCCC"/>
+              <w:left w:val="none"/>
+              <w:right w:val="none"/>
+            </w:tcBorders>
+          </w:tcPr>
+          <w:p>
+            <w:pPr>
+              <w:spacing w:line="240" w:lineRule="auto" w:before="20" w:after="20"/>
+              <w:jc w:val="center"/>
+            </w:pPr>
+            <w:r>
+              <w:rPr>
+                <w:rFonts w:ascii="Times New Roman" w:hAnsi="Times New Roman"/>
+                <w:sz w:val="14"/>
+              </w:rPr>
+              <w:t>[5]</w:t>
+            </w:r>
+          </w:p>
+        </w:tc>
+        <w:tc>
+          <w:tcPr>
+            <w:tcW w:type="dxa" w:w="1440"/>
             <w:tcBorders>
               <w:top w:val="single" w:sz="4" w:space="0" w:color="CCCCCC"/>
               <w:bottom w:val="single" w:sz="4" w:space="0" w:color="CCCCCC"/>
@@ -8947,7 +9169,7 @@
             <w:r>
               <w:rPr>
                 <w:rFonts w:ascii="Times New Roman" w:hAnsi="Times New Roman"/>
-                <w:sz w:val="15"/>
+                <w:sz w:val="14"/>
               </w:rPr>
               <w:t>Ali Khandokar I. et al. (2025)</w:t>
             </w:r>
@@ -8971,7 +9193,7 @@
             <w:r>
               <w:rPr>
                 <w:rFonts w:ascii="Times New Roman" w:hAnsi="Times New Roman"/>
-                <w:sz w:val="15"/>
+                <w:sz w:val="14"/>
               </w:rPr>
               <w:t>✔</w:t>
             </w:r>
@@ -8995,7 +9217,7 @@
             <w:r>
               <w:rPr>
                 <w:rFonts w:ascii="Times New Roman" w:hAnsi="Times New Roman"/>
-                <w:sz w:val="15"/>
+                <w:sz w:val="14"/>
               </w:rPr>
               <w:t>✔</w:t>
             </w:r>
@@ -9019,7 +9241,7 @@
             <w:r>
               <w:rPr>
                 <w:rFonts w:ascii="Times New Roman" w:hAnsi="Times New Roman"/>
-                <w:sz w:val="15"/>
+                <w:sz w:val="14"/>
               </w:rPr>
               <w:t>✔</w:t>
             </w:r>
@@ -9043,7 +9265,7 @@
             <w:r>
               <w:rPr>
                 <w:rFonts w:ascii="Times New Roman" w:hAnsi="Times New Roman"/>
-                <w:sz w:val="15"/>
+                <w:sz w:val="14"/>
               </w:rPr>
               <w:t>✔</w:t>
             </w:r>
@@ -9067,7 +9289,7 @@
             <w:r>
               <w:rPr>
                 <w:rFonts w:ascii="Times New Roman" w:hAnsi="Times New Roman"/>
-                <w:sz w:val="15"/>
+                <w:sz w:val="14"/>
               </w:rPr>
               <w:t>4/4</w:t>
             </w:r>
@@ -9075,7 +9297,7 @@
         </w:tc>
         <w:tc>
           <w:tcPr>
-            <w:tcW w:type="dxa" w:w="1152"/>
+            <w:tcW w:type="dxa" w:w="1008"/>
             <w:tcBorders>
               <w:top w:val="single" w:sz="4" w:space="0" w:color="CCCCCC"/>
               <w:bottom w:val="single" w:sz="4" w:space="0" w:color="CCCCCC"/>
@@ -9091,7 +9313,7 @@
             <w:r>
               <w:rPr>
                 <w:rFonts w:ascii="Times New Roman" w:hAnsi="Times New Roman"/>
-                <w:sz w:val="15"/>
+                <w:sz w:val="14"/>
               </w:rPr>
               <w:t>Nuclear</w:t>
             </w:r>
@@ -9104,7 +9326,7 @@
         </w:trPr>
         <w:tc>
           <w:tcPr>
-            <w:tcW w:type="dxa" w:w="576"/>
+            <w:tcW w:type="dxa" w:w="504"/>
             <w:tcBorders>
               <w:top w:val="single" w:sz="4" w:space="0" w:color="CCCCCC"/>
               <w:bottom w:val="single" w:sz="4" w:space="0" w:color="CCCCCC"/>
@@ -9120,7 +9342,7 @@
             <w:r>
               <w:rPr>
                 <w:rFonts w:ascii="Times New Roman" w:hAnsi="Times New Roman"/>
-                <w:sz w:val="15"/>
+                <w:sz w:val="14"/>
               </w:rPr>
               <w:t>[S004]</w:t>
             </w:r>
@@ -9128,7 +9350,31 @@
         </w:tc>
         <w:tc>
           <w:tcPr>
-            <w:tcW w:type="dxa" w:w="1584"/>
+            <w:tcW w:type="dxa" w:w="432"/>
+            <w:tcBorders>
+              <w:top w:val="single" w:sz="4" w:space="0" w:color="CCCCCC"/>
+              <w:bottom w:val="single" w:sz="4" w:space="0" w:color="CCCCCC"/>
+              <w:left w:val="none"/>
+              <w:right w:val="none"/>
+            </w:tcBorders>
+          </w:tcPr>
+          <w:p>
+            <w:pPr>
+              <w:spacing w:line="240" w:lineRule="auto" w:before="20" w:after="20"/>
+              <w:jc w:val="center"/>
+            </w:pPr>
+            <w:r>
+              <w:rPr>
+                <w:rFonts w:ascii="Times New Roman" w:hAnsi="Times New Roman"/>
+                <w:sz w:val="14"/>
+              </w:rPr>
+              <w:t>[6]</w:t>
+            </w:r>
+          </w:p>
+        </w:tc>
+        <w:tc>
+          <w:tcPr>
+            <w:tcW w:type="dxa" w:w="1440"/>
             <w:tcBorders>
               <w:top w:val="single" w:sz="4" w:space="0" w:color="CCCCCC"/>
               <w:bottom w:val="single" w:sz="4" w:space="0" w:color="CCCCCC"/>
@@ -9144,7 +9390,7 @@
             <w:r>
               <w:rPr>
                 <w:rFonts w:ascii="Times New Roman" w:hAnsi="Times New Roman"/>
-                <w:sz w:val="15"/>
+                <w:sz w:val="14"/>
               </w:rPr>
               <w:t>Mifsud X. et al. (2025)</w:t>
             </w:r>
@@ -9168,7 +9414,7 @@
             <w:r>
               <w:rPr>
                 <w:rFonts w:ascii="Times New Roman" w:hAnsi="Times New Roman"/>
-                <w:sz w:val="15"/>
+                <w:sz w:val="14"/>
               </w:rPr>
               <w:t>✔</w:t>
             </w:r>
@@ -9192,7 +9438,7 @@
             <w:r>
               <w:rPr>
                 <w:rFonts w:ascii="Times New Roman" w:hAnsi="Times New Roman"/>
-                <w:sz w:val="15"/>
+                <w:sz w:val="14"/>
               </w:rPr>
               <w:t>✔</w:t>
             </w:r>
@@ -9216,7 +9462,7 @@
             <w:r>
               <w:rPr>
                 <w:rFonts w:ascii="Times New Roman" w:hAnsi="Times New Roman"/>
-                <w:sz w:val="15"/>
+                <w:sz w:val="14"/>
               </w:rPr>
               <w:t>✔</w:t>
             </w:r>
@@ -9240,7 +9486,7 @@
             <w:r>
               <w:rPr>
                 <w:rFonts w:ascii="Times New Roman" w:hAnsi="Times New Roman"/>
-                <w:sz w:val="15"/>
+                <w:sz w:val="14"/>
               </w:rPr>
               <w:t>✔</w:t>
             </w:r>
@@ -9264,7 +9510,7 @@
             <w:r>
               <w:rPr>
                 <w:rFonts w:ascii="Times New Roman" w:hAnsi="Times New Roman"/>
-                <w:sz w:val="15"/>
+                <w:sz w:val="14"/>
               </w:rPr>
               <w:t>4/4</w:t>
             </w:r>
@@ -9272,7 +9518,7 @@
         </w:tc>
         <w:tc>
           <w:tcPr>
-            <w:tcW w:type="dxa" w:w="1152"/>
+            <w:tcW w:type="dxa" w:w="1008"/>
             <w:tcBorders>
               <w:top w:val="single" w:sz="4" w:space="0" w:color="CCCCCC"/>
               <w:bottom w:val="single" w:sz="4" w:space="0" w:color="CCCCCC"/>
@@ -9288,7 +9534,7 @@
             <w:r>
               <w:rPr>
                 <w:rFonts w:ascii="Times New Roman" w:hAnsi="Times New Roman"/>
-                <w:sz w:val="15"/>
+                <w:sz w:val="14"/>
               </w:rPr>
               <w:t>Nuclear</w:t>
             </w:r>
@@ -9301,7 +9547,7 @@
         </w:trPr>
         <w:tc>
           <w:tcPr>
-            <w:tcW w:type="dxa" w:w="576"/>
+            <w:tcW w:type="dxa" w:w="504"/>
             <w:tcBorders>
               <w:top w:val="single" w:sz="4" w:space="0" w:color="CCCCCC"/>
               <w:bottom w:val="single" w:sz="4" w:space="0" w:color="CCCCCC"/>
@@ -9317,7 +9563,7 @@
             <w:r>
               <w:rPr>
                 <w:rFonts w:ascii="Times New Roman" w:hAnsi="Times New Roman"/>
-                <w:sz w:val="15"/>
+                <w:sz w:val="14"/>
               </w:rPr>
               <w:t>[S005]</w:t>
             </w:r>
@@ -9325,7 +9571,31 @@
         </w:tc>
         <w:tc>
           <w:tcPr>
-            <w:tcW w:type="dxa" w:w="1584"/>
+            <w:tcW w:type="dxa" w:w="432"/>
+            <w:tcBorders>
+              <w:top w:val="single" w:sz="4" w:space="0" w:color="CCCCCC"/>
+              <w:bottom w:val="single" w:sz="4" w:space="0" w:color="CCCCCC"/>
+              <w:left w:val="none"/>
+              <w:right w:val="none"/>
+            </w:tcBorders>
+          </w:tcPr>
+          <w:p>
+            <w:pPr>
+              <w:spacing w:line="240" w:lineRule="auto" w:before="20" w:after="20"/>
+              <w:jc w:val="center"/>
+            </w:pPr>
+            <w:r>
+              <w:rPr>
+                <w:rFonts w:ascii="Times New Roman" w:hAnsi="Times New Roman"/>
+                <w:sz w:val="14"/>
+              </w:rPr>
+              <w:t>[7]</w:t>
+            </w:r>
+          </w:p>
+        </w:tc>
+        <w:tc>
+          <w:tcPr>
+            <w:tcW w:type="dxa" w:w="1440"/>
             <w:tcBorders>
               <w:top w:val="single" w:sz="4" w:space="0" w:color="CCCCCC"/>
               <w:bottom w:val="single" w:sz="4" w:space="0" w:color="CCCCCC"/>
@@ -9341,7 +9611,7 @@
             <w:r>
               <w:rPr>
                 <w:rFonts w:ascii="Times New Roman" w:hAnsi="Times New Roman"/>
-                <w:sz w:val="15"/>
+                <w:sz w:val="14"/>
               </w:rPr>
               <w:t>Yu J.-M. et al. (2025)</w:t>
             </w:r>
@@ -9365,7 +9635,7 @@
             <w:r>
               <w:rPr>
                 <w:rFonts w:ascii="Times New Roman" w:hAnsi="Times New Roman"/>
-                <w:sz w:val="15"/>
+                <w:sz w:val="14"/>
               </w:rPr>
               <w:t>✔</w:t>
             </w:r>
@@ -9389,7 +9659,7 @@
             <w:r>
               <w:rPr>
                 <w:rFonts w:ascii="Times New Roman" w:hAnsi="Times New Roman"/>
-                <w:sz w:val="15"/>
+                <w:sz w:val="14"/>
               </w:rPr>
               <w:t>✔</w:t>
             </w:r>
@@ -9413,7 +9683,7 @@
             <w:r>
               <w:rPr>
                 <w:rFonts w:ascii="Times New Roman" w:hAnsi="Times New Roman"/>
-                <w:sz w:val="15"/>
+                <w:sz w:val="14"/>
               </w:rPr>
               <w:t>✔</w:t>
             </w:r>
@@ -9437,7 +9707,7 @@
             <w:r>
               <w:rPr>
                 <w:rFonts w:ascii="Times New Roman" w:hAnsi="Times New Roman"/>
-                <w:sz w:val="15"/>
+                <w:sz w:val="14"/>
               </w:rPr>
               <w:t>✔</w:t>
             </w:r>
@@ -9461,7 +9731,7 @@
             <w:r>
               <w:rPr>
                 <w:rFonts w:ascii="Times New Roman" w:hAnsi="Times New Roman"/>
-                <w:sz w:val="15"/>
+                <w:sz w:val="14"/>
               </w:rPr>
               <w:t>4/4</w:t>
             </w:r>
@@ -9469,7 +9739,7 @@
         </w:tc>
         <w:tc>
           <w:tcPr>
-            <w:tcW w:type="dxa" w:w="1152"/>
+            <w:tcW w:type="dxa" w:w="1008"/>
             <w:tcBorders>
               <w:top w:val="single" w:sz="4" w:space="0" w:color="CCCCCC"/>
               <w:bottom w:val="single" w:sz="4" w:space="0" w:color="CCCCCC"/>
@@ -9485,7 +9755,7 @@
             <w:r>
               <w:rPr>
                 <w:rFonts w:ascii="Times New Roman" w:hAnsi="Times New Roman"/>
-                <w:sz w:val="15"/>
+                <w:sz w:val="14"/>
               </w:rPr>
               <w:t>Soporte (4/4)</w:t>
             </w:r>
@@ -9498,7 +9768,7 @@
         </w:trPr>
         <w:tc>
           <w:tcPr>
-            <w:tcW w:type="dxa" w:w="576"/>
+            <w:tcW w:type="dxa" w:w="504"/>
             <w:tcBorders>
               <w:top w:val="single" w:sz="4" w:space="0" w:color="CCCCCC"/>
               <w:bottom w:val="single" w:sz="4" w:space="0" w:color="CCCCCC"/>
@@ -9514,7 +9784,7 @@
             <w:r>
               <w:rPr>
                 <w:rFonts w:ascii="Times New Roman" w:hAnsi="Times New Roman"/>
-                <w:sz w:val="15"/>
+                <w:sz w:val="14"/>
               </w:rPr>
               <w:t>[S015]</w:t>
             </w:r>
@@ -9522,7 +9792,31 @@
         </w:tc>
         <w:tc>
           <w:tcPr>
-            <w:tcW w:type="dxa" w:w="1584"/>
+            <w:tcW w:type="dxa" w:w="432"/>
+            <w:tcBorders>
+              <w:top w:val="single" w:sz="4" w:space="0" w:color="CCCCCC"/>
+              <w:bottom w:val="single" w:sz="4" w:space="0" w:color="CCCCCC"/>
+              <w:left w:val="none"/>
+              <w:right w:val="none"/>
+            </w:tcBorders>
+          </w:tcPr>
+          <w:p>
+            <w:pPr>
+              <w:spacing w:line="240" w:lineRule="auto" w:before="20" w:after="20"/>
+              <w:jc w:val="center"/>
+            </w:pPr>
+            <w:r>
+              <w:rPr>
+                <w:rFonts w:ascii="Times New Roman" w:hAnsi="Times New Roman"/>
+                <w:sz w:val="14"/>
+              </w:rPr>
+              <w:t>[17]</w:t>
+            </w:r>
+          </w:p>
+        </w:tc>
+        <w:tc>
+          <w:tcPr>
+            <w:tcW w:type="dxa" w:w="1440"/>
             <w:tcBorders>
               <w:top w:val="single" w:sz="4" w:space="0" w:color="CCCCCC"/>
               <w:bottom w:val="single" w:sz="4" w:space="0" w:color="CCCCCC"/>
@@ -9538,7 +9832,7 @@
             <w:r>
               <w:rPr>
                 <w:rFonts w:ascii="Times New Roman" w:hAnsi="Times New Roman"/>
-                <w:sz w:val="15"/>
+                <w:sz w:val="14"/>
               </w:rPr>
               <w:t>Abdalla M. et al. (2025)</w:t>
             </w:r>
@@ -9562,7 +9856,7 @@
             <w:r>
               <w:rPr>
                 <w:rFonts w:ascii="Times New Roman" w:hAnsi="Times New Roman"/>
-                <w:sz w:val="15"/>
+                <w:sz w:val="14"/>
               </w:rPr>
               <w:t>✔</w:t>
             </w:r>
@@ -9586,7 +9880,7 @@
             <w:r>
               <w:rPr>
                 <w:rFonts w:ascii="Times New Roman" w:hAnsi="Times New Roman"/>
-                <w:sz w:val="15"/>
+                <w:sz w:val="14"/>
               </w:rPr>
               <w:t>✔</w:t>
             </w:r>
@@ -9610,7 +9904,7 @@
             <w:r>
               <w:rPr>
                 <w:rFonts w:ascii="Times New Roman" w:hAnsi="Times New Roman"/>
-                <w:sz w:val="15"/>
+                <w:sz w:val="14"/>
               </w:rPr>
               <w:t>✔</w:t>
             </w:r>
@@ -9634,7 +9928,7 @@
             <w:r>
               <w:rPr>
                 <w:rFonts w:ascii="Times New Roman" w:hAnsi="Times New Roman"/>
-                <w:sz w:val="15"/>
+                <w:sz w:val="14"/>
               </w:rPr>
               <w:t>✔</w:t>
             </w:r>
@@ -9658,7 +9952,7 @@
             <w:r>
               <w:rPr>
                 <w:rFonts w:ascii="Times New Roman" w:hAnsi="Times New Roman"/>
-                <w:sz w:val="15"/>
+                <w:sz w:val="14"/>
               </w:rPr>
               <w:t>4/4</w:t>
             </w:r>
@@ -9666,7 +9960,7 @@
         </w:tc>
         <w:tc>
           <w:tcPr>
-            <w:tcW w:type="dxa" w:w="1152"/>
+            <w:tcW w:type="dxa" w:w="1008"/>
             <w:tcBorders>
               <w:top w:val="single" w:sz="4" w:space="0" w:color="CCCCCC"/>
               <w:bottom w:val="single" w:sz="4" w:space="0" w:color="CCCCCC"/>
@@ -9682,7 +9976,7 @@
             <w:r>
               <w:rPr>
                 <w:rFonts w:ascii="Times New Roman" w:hAnsi="Times New Roman"/>
-                <w:sz w:val="15"/>
+                <w:sz w:val="14"/>
               </w:rPr>
               <w:t>Soporte (4/4)</w:t>
             </w:r>
@@ -9695,7 +9989,7 @@
         </w:trPr>
         <w:tc>
           <w:tcPr>
-            <w:tcW w:type="dxa" w:w="576"/>
+            <w:tcW w:type="dxa" w:w="504"/>
             <w:tcBorders>
               <w:top w:val="single" w:sz="4" w:space="0" w:color="CCCCCC"/>
               <w:bottom w:val="single" w:sz="4" w:space="0" w:color="CCCCCC"/>
@@ -9711,7 +10005,7 @@
             <w:r>
               <w:rPr>
                 <w:rFonts w:ascii="Times New Roman" w:hAnsi="Times New Roman"/>
-                <w:sz w:val="15"/>
+                <w:sz w:val="14"/>
               </w:rPr>
               <w:t>[S030]</w:t>
             </w:r>
@@ -9719,7 +10013,31 @@
         </w:tc>
         <w:tc>
           <w:tcPr>
-            <w:tcW w:type="dxa" w:w="1584"/>
+            <w:tcW w:type="dxa" w:w="432"/>
+            <w:tcBorders>
+              <w:top w:val="single" w:sz="4" w:space="0" w:color="CCCCCC"/>
+              <w:bottom w:val="single" w:sz="4" w:space="0" w:color="CCCCCC"/>
+              <w:left w:val="none"/>
+              <w:right w:val="none"/>
+            </w:tcBorders>
+          </w:tcPr>
+          <w:p>
+            <w:pPr>
+              <w:spacing w:line="240" w:lineRule="auto" w:before="20" w:after="20"/>
+              <w:jc w:val="center"/>
+            </w:pPr>
+            <w:r>
+              <w:rPr>
+                <w:rFonts w:ascii="Times New Roman" w:hAnsi="Times New Roman"/>
+                <w:sz w:val="14"/>
+              </w:rPr>
+              <w:t>[32]</w:t>
+            </w:r>
+          </w:p>
+        </w:tc>
+        <w:tc>
+          <w:tcPr>
+            <w:tcW w:type="dxa" w:w="1440"/>
             <w:tcBorders>
               <w:top w:val="single" w:sz="4" w:space="0" w:color="CCCCCC"/>
               <w:bottom w:val="single" w:sz="4" w:space="0" w:color="CCCCCC"/>
@@ -9735,7 +10053,7 @@
             <w:r>
               <w:rPr>
                 <w:rFonts w:ascii="Times New Roman" w:hAnsi="Times New Roman"/>
-                <w:sz w:val="15"/>
+                <w:sz w:val="14"/>
               </w:rPr>
               <w:t>Jia M. et al. (2025)</w:t>
             </w:r>
@@ -9759,7 +10077,7 @@
             <w:r>
               <w:rPr>
                 <w:rFonts w:ascii="Times New Roman" w:hAnsi="Times New Roman"/>
-                <w:sz w:val="15"/>
+                <w:sz w:val="14"/>
               </w:rPr>
               <w:t>✔</w:t>
             </w:r>
@@ -9783,7 +10101,7 @@
             <w:r>
               <w:rPr>
                 <w:rFonts w:ascii="Times New Roman" w:hAnsi="Times New Roman"/>
-                <w:sz w:val="15"/>
+                <w:sz w:val="14"/>
               </w:rPr>
               <w:t>✔</w:t>
             </w:r>
@@ -9807,7 +10125,7 @@
             <w:r>
               <w:rPr>
                 <w:rFonts w:ascii="Times New Roman" w:hAnsi="Times New Roman"/>
-                <w:sz w:val="15"/>
+                <w:sz w:val="14"/>
               </w:rPr>
               <w:t>✔</w:t>
             </w:r>
@@ -9831,7 +10149,7 @@
             <w:r>
               <w:rPr>
                 <w:rFonts w:ascii="Times New Roman" w:hAnsi="Times New Roman"/>
-                <w:sz w:val="15"/>
+                <w:sz w:val="14"/>
               </w:rPr>
               <w:t>✔</w:t>
             </w:r>
@@ -9855,7 +10173,7 @@
             <w:r>
               <w:rPr>
                 <w:rFonts w:ascii="Times New Roman" w:hAnsi="Times New Roman"/>
-                <w:sz w:val="15"/>
+                <w:sz w:val="14"/>
               </w:rPr>
               <w:t>4/4</w:t>
             </w:r>
@@ -9863,7 +10181,7 @@
         </w:tc>
         <w:tc>
           <w:tcPr>
-            <w:tcW w:type="dxa" w:w="1152"/>
+            <w:tcW w:type="dxa" w:w="1008"/>
             <w:tcBorders>
               <w:top w:val="single" w:sz="4" w:space="0" w:color="CCCCCC"/>
               <w:bottom w:val="single" w:sz="4" w:space="0" w:color="CCCCCC"/>
@@ -9879,7 +10197,7 @@
             <w:r>
               <w:rPr>
                 <w:rFonts w:ascii="Times New Roman" w:hAnsi="Times New Roman"/>
-                <w:sz w:val="15"/>
+                <w:sz w:val="14"/>
               </w:rPr>
               <w:t>Soporte (4/4)</w:t>
             </w:r>
@@ -9892,7 +10210,7 @@
         </w:trPr>
         <w:tc>
           <w:tcPr>
-            <w:tcW w:type="dxa" w:w="576"/>
+            <w:tcW w:type="dxa" w:w="504"/>
             <w:tcBorders>
               <w:top w:val="single" w:sz="4" w:space="0" w:color="CCCCCC"/>
               <w:bottom w:val="single" w:sz="4" w:space="0" w:color="CCCCCC"/>
@@ -9908,7 +10226,7 @@
             <w:r>
               <w:rPr>
                 <w:rFonts w:ascii="Times New Roman" w:hAnsi="Times New Roman"/>
-                <w:sz w:val="15"/>
+                <w:sz w:val="14"/>
               </w:rPr>
               <w:t>[S050]</w:t>
             </w:r>
@@ -9916,7 +10234,31 @@
         </w:tc>
         <w:tc>
           <w:tcPr>
-            <w:tcW w:type="dxa" w:w="1584"/>
+            <w:tcW w:type="dxa" w:w="432"/>
+            <w:tcBorders>
+              <w:top w:val="single" w:sz="4" w:space="0" w:color="CCCCCC"/>
+              <w:bottom w:val="single" w:sz="4" w:space="0" w:color="CCCCCC"/>
+              <w:left w:val="none"/>
+              <w:right w:val="none"/>
+            </w:tcBorders>
+          </w:tcPr>
+          <w:p>
+            <w:pPr>
+              <w:spacing w:line="240" w:lineRule="auto" w:before="20" w:after="20"/>
+              <w:jc w:val="center"/>
+            </w:pPr>
+            <w:r>
+              <w:rPr>
+                <w:rFonts w:ascii="Times New Roman" w:hAnsi="Times New Roman"/>
+                <w:sz w:val="14"/>
+              </w:rPr>
+              <w:t>[52]</w:t>
+            </w:r>
+          </w:p>
+        </w:tc>
+        <w:tc>
+          <w:tcPr>
+            <w:tcW w:type="dxa" w:w="1440"/>
             <w:tcBorders>
               <w:top w:val="single" w:sz="4" w:space="0" w:color="CCCCCC"/>
               <w:bottom w:val="single" w:sz="4" w:space="0" w:color="CCCCCC"/>
@@ -9932,7 +10274,7 @@
             <w:r>
               <w:rPr>
                 <w:rFonts w:ascii="Times New Roman" w:hAnsi="Times New Roman"/>
-                <w:sz w:val="15"/>
+                <w:sz w:val="14"/>
               </w:rPr>
               <w:t>Lee E. et al. (2022)</w:t>
             </w:r>
@@ -9956,7 +10298,7 @@
             <w:r>
               <w:rPr>
                 <w:rFonts w:ascii="Times New Roman" w:hAnsi="Times New Roman"/>
-                <w:sz w:val="15"/>
+                <w:sz w:val="14"/>
               </w:rPr>
               <w:t>✔</w:t>
             </w:r>
@@ -9980,7 +10322,7 @@
             <w:r>
               <w:rPr>
                 <w:rFonts w:ascii="Times New Roman" w:hAnsi="Times New Roman"/>
-                <w:sz w:val="15"/>
+                <w:sz w:val="14"/>
               </w:rPr>
               <w:t>✔</w:t>
             </w:r>
@@ -10004,7 +10346,7 @@
             <w:r>
               <w:rPr>
                 <w:rFonts w:ascii="Times New Roman" w:hAnsi="Times New Roman"/>
-                <w:sz w:val="15"/>
+                <w:sz w:val="14"/>
               </w:rPr>
               <w:t>✔</w:t>
             </w:r>
@@ -10028,7 +10370,7 @@
             <w:r>
               <w:rPr>
                 <w:rFonts w:ascii="Times New Roman" w:hAnsi="Times New Roman"/>
-                <w:sz w:val="15"/>
+                <w:sz w:val="14"/>
               </w:rPr>
               <w:t>✔</w:t>
             </w:r>
@@ -10052,7 +10394,7 @@
             <w:r>
               <w:rPr>
                 <w:rFonts w:ascii="Times New Roman" w:hAnsi="Times New Roman"/>
-                <w:sz w:val="15"/>
+                <w:sz w:val="14"/>
               </w:rPr>
               <w:t>4/4</w:t>
             </w:r>
@@ -10060,7 +10402,7 @@
         </w:tc>
         <w:tc>
           <w:tcPr>
-            <w:tcW w:type="dxa" w:w="1152"/>
+            <w:tcW w:type="dxa" w:w="1008"/>
             <w:tcBorders>
               <w:top w:val="single" w:sz="4" w:space="0" w:color="CCCCCC"/>
               <w:bottom w:val="single" w:sz="4" w:space="0" w:color="CCCCCC"/>
@@ -10076,7 +10418,7 @@
             <w:r>
               <w:rPr>
                 <w:rFonts w:ascii="Times New Roman" w:hAnsi="Times New Roman"/>
-                <w:sz w:val="15"/>
+                <w:sz w:val="14"/>
               </w:rPr>
               <w:t>Soporte (4/4)</w:t>
             </w:r>
@@ -10089,7 +10431,7 @@
         </w:trPr>
         <w:tc>
           <w:tcPr>
-            <w:tcW w:type="dxa" w:w="576"/>
+            <w:tcW w:type="dxa" w:w="504"/>
             <w:tcBorders>
               <w:top w:val="single" w:sz="4" w:space="0" w:color="CCCCCC"/>
               <w:bottom w:val="single" w:sz="4" w:space="0" w:color="CCCCCC"/>
@@ -10105,7 +10447,7 @@
             <w:r>
               <w:rPr>
                 <w:rFonts w:ascii="Times New Roman" w:hAnsi="Times New Roman"/>
-                <w:sz w:val="15"/>
+                <w:sz w:val="14"/>
               </w:rPr>
               <w:t>[S075]</w:t>
             </w:r>
@@ -10113,7 +10455,31 @@
         </w:tc>
         <w:tc>
           <w:tcPr>
-            <w:tcW w:type="dxa" w:w="1584"/>
+            <w:tcW w:type="dxa" w:w="432"/>
+            <w:tcBorders>
+              <w:top w:val="single" w:sz="4" w:space="0" w:color="CCCCCC"/>
+              <w:bottom w:val="single" w:sz="4" w:space="0" w:color="CCCCCC"/>
+              <w:left w:val="none"/>
+              <w:right w:val="none"/>
+            </w:tcBorders>
+          </w:tcPr>
+          <w:p>
+            <w:pPr>
+              <w:spacing w:line="240" w:lineRule="auto" w:before="20" w:after="20"/>
+              <w:jc w:val="center"/>
+            </w:pPr>
+            <w:r>
+              <w:rPr>
+                <w:rFonts w:ascii="Times New Roman" w:hAnsi="Times New Roman"/>
+                <w:sz w:val="14"/>
+              </w:rPr>
+              <w:t>[77]</w:t>
+            </w:r>
+          </w:p>
+        </w:tc>
+        <w:tc>
+          <w:tcPr>
+            <w:tcW w:type="dxa" w:w="1440"/>
             <w:tcBorders>
               <w:top w:val="single" w:sz="4" w:space="0" w:color="CCCCCC"/>
               <w:bottom w:val="single" w:sz="4" w:space="0" w:color="CCCCCC"/>
@@ -10129,7 +10495,7 @@
             <w:r>
               <w:rPr>
                 <w:rFonts w:ascii="Times New Roman" w:hAnsi="Times New Roman"/>
-                <w:sz w:val="15"/>
+                <w:sz w:val="14"/>
               </w:rPr>
               <w:t>Arshad A. et al. (2025)</w:t>
             </w:r>
@@ -10153,7 +10519,7 @@
             <w:r>
               <w:rPr>
                 <w:rFonts w:ascii="Times New Roman" w:hAnsi="Times New Roman"/>
-                <w:sz w:val="15"/>
+                <w:sz w:val="14"/>
               </w:rPr>
               <w:t>✔</w:t>
             </w:r>
@@ -10177,7 +10543,7 @@
             <w:r>
               <w:rPr>
                 <w:rFonts w:ascii="Times New Roman" w:hAnsi="Times New Roman"/>
-                <w:sz w:val="15"/>
+                <w:sz w:val="14"/>
               </w:rPr>
               <w:t>✔</w:t>
             </w:r>
@@ -10201,7 +10567,7 @@
             <w:r>
               <w:rPr>
                 <w:rFonts w:ascii="Times New Roman" w:hAnsi="Times New Roman"/>
-                <w:sz w:val="15"/>
+                <w:sz w:val="14"/>
               </w:rPr>
               <w:t>—</w:t>
             </w:r>
@@ -10225,7 +10591,7 @@
             <w:r>
               <w:rPr>
                 <w:rFonts w:ascii="Times New Roman" w:hAnsi="Times New Roman"/>
-                <w:sz w:val="15"/>
+                <w:sz w:val="14"/>
               </w:rPr>
               <w:t>✔</w:t>
             </w:r>
@@ -10249,7 +10615,7 @@
             <w:r>
               <w:rPr>
                 <w:rFonts w:ascii="Times New Roman" w:hAnsi="Times New Roman"/>
-                <w:sz w:val="15"/>
+                <w:sz w:val="14"/>
               </w:rPr>
               <w:t>3/4</w:t>
             </w:r>
@@ -10257,7 +10623,7 @@
         </w:tc>
         <w:tc>
           <w:tcPr>
-            <w:tcW w:type="dxa" w:w="1152"/>
+            <w:tcW w:type="dxa" w:w="1008"/>
             <w:tcBorders>
               <w:top w:val="single" w:sz="4" w:space="0" w:color="CCCCCC"/>
               <w:bottom w:val="single" w:sz="4" w:space="0" w:color="CCCCCC"/>
@@ -10273,7 +10639,7 @@
             <w:r>
               <w:rPr>
                 <w:rFonts w:ascii="Times New Roman" w:hAnsi="Times New Roman"/>
-                <w:sz w:val="15"/>
+                <w:sz w:val="14"/>
               </w:rPr>
               <w:t>Soporte (3/4)</w:t>
             </w:r>
@@ -10286,7 +10652,7 @@
         </w:trPr>
         <w:tc>
           <w:tcPr>
-            <w:tcW w:type="dxa" w:w="576"/>
+            <w:tcW w:type="dxa" w:w="504"/>
             <w:tcBorders>
               <w:top w:val="single" w:sz="4" w:space="0" w:color="CCCCCC"/>
               <w:bottom w:val="single" w:sz="4" w:space="0" w:color="CCCCCC"/>
@@ -10302,7 +10668,7 @@
             <w:r>
               <w:rPr>
                 <w:rFonts w:ascii="Times New Roman" w:hAnsi="Times New Roman"/>
-                <w:sz w:val="15"/>
+                <w:sz w:val="14"/>
               </w:rPr>
               <w:t>[S100]</w:t>
             </w:r>
@@ -10310,7 +10676,31 @@
         </w:tc>
         <w:tc>
           <w:tcPr>
-            <w:tcW w:type="dxa" w:w="1584"/>
+            <w:tcW w:type="dxa" w:w="432"/>
+            <w:tcBorders>
+              <w:top w:val="single" w:sz="4" w:space="0" w:color="CCCCCC"/>
+              <w:bottom w:val="single" w:sz="4" w:space="0" w:color="CCCCCC"/>
+              <w:left w:val="none"/>
+              <w:right w:val="none"/>
+            </w:tcBorders>
+          </w:tcPr>
+          <w:p>
+            <w:pPr>
+              <w:spacing w:line="240" w:lineRule="auto" w:before="20" w:after="20"/>
+              <w:jc w:val="center"/>
+            </w:pPr>
+            <w:r>
+              <w:rPr>
+                <w:rFonts w:ascii="Times New Roman" w:hAnsi="Times New Roman"/>
+                <w:sz w:val="14"/>
+              </w:rPr>
+              <w:t>[102]</w:t>
+            </w:r>
+          </w:p>
+        </w:tc>
+        <w:tc>
+          <w:tcPr>
+            <w:tcW w:type="dxa" w:w="1440"/>
             <w:tcBorders>
               <w:top w:val="single" w:sz="4" w:space="0" w:color="CCCCCC"/>
               <w:bottom w:val="single" w:sz="4" w:space="0" w:color="CCCCCC"/>
@@ -10326,7 +10716,7 @@
             <w:r>
               <w:rPr>
                 <w:rFonts w:ascii="Times New Roman" w:hAnsi="Times New Roman"/>
-                <w:sz w:val="15"/>
+                <w:sz w:val="14"/>
               </w:rPr>
               <w:t>Yeung O.M. et al. (2023)</w:t>
             </w:r>
@@ -10350,7 +10740,7 @@
             <w:r>
               <w:rPr>
                 <w:rFonts w:ascii="Times New Roman" w:hAnsi="Times New Roman"/>
-                <w:sz w:val="15"/>
+                <w:sz w:val="14"/>
               </w:rPr>
               <w:t>—</w:t>
             </w:r>
@@ -10374,7 +10764,7 @@
             <w:r>
               <w:rPr>
                 <w:rFonts w:ascii="Times New Roman" w:hAnsi="Times New Roman"/>
-                <w:sz w:val="15"/>
+                <w:sz w:val="14"/>
               </w:rPr>
               <w:t>✔</w:t>
             </w:r>
@@ -10398,7 +10788,7 @@
             <w:r>
               <w:rPr>
                 <w:rFonts w:ascii="Times New Roman" w:hAnsi="Times New Roman"/>
-                <w:sz w:val="15"/>
+                <w:sz w:val="14"/>
               </w:rPr>
               <w:t>✔</w:t>
             </w:r>
@@ -10422,7 +10812,7 @@
             <w:r>
               <w:rPr>
                 <w:rFonts w:ascii="Times New Roman" w:hAnsi="Times New Roman"/>
-                <w:sz w:val="15"/>
+                <w:sz w:val="14"/>
               </w:rPr>
               <w:t>✔</w:t>
             </w:r>
@@ -10446,7 +10836,7 @@
             <w:r>
               <w:rPr>
                 <w:rFonts w:ascii="Times New Roman" w:hAnsi="Times New Roman"/>
-                <w:sz w:val="15"/>
+                <w:sz w:val="14"/>
               </w:rPr>
               <w:t>3/4</w:t>
             </w:r>
@@ -10454,7 +10844,7 @@
         </w:tc>
         <w:tc>
           <w:tcPr>
-            <w:tcW w:type="dxa" w:w="1152"/>
+            <w:tcW w:type="dxa" w:w="1008"/>
             <w:tcBorders>
               <w:top w:val="single" w:sz="4" w:space="0" w:color="CCCCCC"/>
               <w:bottom w:val="single" w:sz="4" w:space="0" w:color="CCCCCC"/>
@@ -10470,7 +10860,7 @@
             <w:r>
               <w:rPr>
                 <w:rFonts w:ascii="Times New Roman" w:hAnsi="Times New Roman"/>
-                <w:sz w:val="15"/>
+                <w:sz w:val="14"/>
               </w:rPr>
               <w:t>Soporte (3/4)</w:t>
             </w:r>
@@ -10483,7 +10873,7 @@
         </w:trPr>
         <w:tc>
           <w:tcPr>
-            <w:tcW w:type="dxa" w:w="576"/>
+            <w:tcW w:type="dxa" w:w="504"/>
             <w:tcBorders>
               <w:top w:val="single" w:sz="4" w:space="0" w:color="CCCCCC"/>
               <w:bottom w:val="single" w:sz="4" w:space="0" w:color="CCCCCC"/>
@@ -10499,7 +10889,7 @@
             <w:r>
               <w:rPr>
                 <w:rFonts w:ascii="Times New Roman" w:hAnsi="Times New Roman"/>
-                <w:sz w:val="15"/>
+                <w:sz w:val="14"/>
               </w:rPr>
               <w:t>[S125]</w:t>
             </w:r>
@@ -10507,7 +10897,31 @@
         </w:tc>
         <w:tc>
           <w:tcPr>
-            <w:tcW w:type="dxa" w:w="1584"/>
+            <w:tcW w:type="dxa" w:w="432"/>
+            <w:tcBorders>
+              <w:top w:val="single" w:sz="4" w:space="0" w:color="CCCCCC"/>
+              <w:bottom w:val="single" w:sz="4" w:space="0" w:color="CCCCCC"/>
+              <w:left w:val="none"/>
+              <w:right w:val="none"/>
+            </w:tcBorders>
+          </w:tcPr>
+          <w:p>
+            <w:pPr>
+              <w:spacing w:line="240" w:lineRule="auto" w:before="20" w:after="20"/>
+              <w:jc w:val="center"/>
+            </w:pPr>
+            <w:r>
+              <w:rPr>
+                <w:rFonts w:ascii="Times New Roman" w:hAnsi="Times New Roman"/>
+                <w:sz w:val="14"/>
+              </w:rPr>
+              <w:t>[127]</w:t>
+            </w:r>
+          </w:p>
+        </w:tc>
+        <w:tc>
+          <w:tcPr>
+            <w:tcW w:type="dxa" w:w="1440"/>
             <w:tcBorders>
               <w:top w:val="single" w:sz="4" w:space="0" w:color="CCCCCC"/>
               <w:bottom w:val="single" w:sz="4" w:space="0" w:color="CCCCCC"/>
@@ -10523,7 +10937,7 @@
             <w:r>
               <w:rPr>
                 <w:rFonts w:ascii="Times New Roman" w:hAnsi="Times New Roman"/>
-                <w:sz w:val="15"/>
+                <w:sz w:val="14"/>
               </w:rPr>
               <w:t>Azman N.A. et al. (2021)</w:t>
             </w:r>
@@ -10547,7 +10961,7 @@
             <w:r>
               <w:rPr>
                 <w:rFonts w:ascii="Times New Roman" w:hAnsi="Times New Roman"/>
-                <w:sz w:val="15"/>
+                <w:sz w:val="14"/>
               </w:rPr>
               <w:t>—</w:t>
             </w:r>
@@ -10571,7 +10985,7 @@
             <w:r>
               <w:rPr>
                 <w:rFonts w:ascii="Times New Roman" w:hAnsi="Times New Roman"/>
-                <w:sz w:val="15"/>
+                <w:sz w:val="14"/>
               </w:rPr>
               <w:t>—</w:t>
             </w:r>
@@ -10595,7 +11009,7 @@
             <w:r>
               <w:rPr>
                 <w:rFonts w:ascii="Times New Roman" w:hAnsi="Times New Roman"/>
-                <w:sz w:val="15"/>
+                <w:sz w:val="14"/>
               </w:rPr>
               <w:t>✔</w:t>
             </w:r>
@@ -10619,7 +11033,7 @@
             <w:r>
               <w:rPr>
                 <w:rFonts w:ascii="Times New Roman" w:hAnsi="Times New Roman"/>
-                <w:sz w:val="15"/>
+                <w:sz w:val="14"/>
               </w:rPr>
               <w:t>✔</w:t>
             </w:r>
@@ -10643,7 +11057,7 @@
             <w:r>
               <w:rPr>
                 <w:rFonts w:ascii="Times New Roman" w:hAnsi="Times New Roman"/>
-                <w:sz w:val="15"/>
+                <w:sz w:val="14"/>
               </w:rPr>
               <w:t>2/4</w:t>
             </w:r>
@@ -10651,7 +11065,7 @@
         </w:tc>
         <w:tc>
           <w:tcPr>
-            <w:tcW w:type="dxa" w:w="1152"/>
+            <w:tcW w:type="dxa" w:w="1008"/>
             <w:tcBorders>
               <w:top w:val="single" w:sz="4" w:space="0" w:color="CCCCCC"/>
               <w:bottom w:val="single" w:sz="4" w:space="0" w:color="CCCCCC"/>
@@ -10667,7 +11081,7 @@
             <w:r>
               <w:rPr>
                 <w:rFonts w:ascii="Times New Roman" w:hAnsi="Times New Roman"/>
-                <w:sz w:val="15"/>
+                <w:sz w:val="14"/>
               </w:rPr>
               <w:t>Soporte (2/4)</w:t>
             </w:r>
@@ -10710,7 +11124,7 @@
           <w:i w:val="0"/>
           <w:sz w:val="19"/>
         </w:rPr>
-        <w:t>Siguiendo las directrices metodológicas de Kitchenham &amp; Charters (2007) y PRISMA 2020, los hallazgos de los 131 estudios primarios se consolidaron mediante una síntesis narrativa temática complementada con análisis cuantitativo descriptivo y agregación estadística tabular. Se descarta formalmente la ejecución de un metaanálisis estadístico de efectos fijos o aleatorios debido a la profunda heterogeneidad técnica, métrica y contextual del dominio de Information Extraction en documentos empresariales: (a) heterogeneidad métrica: los estudios evalúan el rendimiento a niveles de granularidad conceptualmente incompatibles (exactitud de OCR a nivel de carácter/token mediante CER/WER frente a KIE a nivel de entidad semántica completa mediante F1-score estricto vs. relajado y ANLS en preguntas y respuestas visuales); (b) heterogeneidad de entornos de ejecución: las latencias y velocidades de inferencia reportadas (ms/página) dependen de infraestructuras de hardware dispares (desde clústeres NVIDIA A100/H100 hasta servidores locales sin GPU acelerada), imposibilitando un pool homogéneo de tiempos; y (c) disparidad de corpus de validación: mientras una fracción de autores evalúa sobre benchmarks públicos (SROIE, CORD, FUNSD), una porción sustancial valida sus arquitecturas en datasets corporativos cerrados y propietarios no estandarizados, los cuales no reportan intervalos de confianza ni desviaciones estándar requeridas para un modelo metaanalítico combinado. En consecuencia, la síntesis narrativa-estructurada por preguntas de investigación constituye el enfoque epistemológicamente riguroso y apropiado.</w:t>
+        <w:t>Siguiendo las directrices metodológicas de Kitchenham &amp; Charters (2007) [1] y PRISMA 2020 [2], los hallazgos de los 131 estudios primarios [3]–[133] se estructuran y consolidan mediante métodos rigurosos y formalizados según la naturaleza de cada interrogante: Síntesis Temática (Thomas &amp; Harden [134]; Cruzes &amp; Dybå [135]) para la taxonomía algorítmica y tipologías documentales (PI1, PI4); Síntesis Narrativa Estructurada (Popay et al. [136]) con reporte de rangos empíricos [mín, máx] y dispersión por benchmark para el rendimiento técnico (PI2); Síntesis sin metaanálisis (SWiM, Campbell et al. [137]) con conteo de votos de dirección del efecto y barras divergentes para la comparativa de eficiencia frente a métodos tradicionales (PI3); Mapeo Sistemático con gráficos de burbujas (Petersen et al. [138]) para el cruce de diseños y datasets (PD3); análisis cienciométrico con mapas de coocurrencia de palabras clave en VOSviewer (van Eck &amp; Waltman [139]) para redes de investigación (PD2); y calificación formal de la certeza de la evidencia mediante el marco GRADE-CERQual (Lewin et al. [140]). Se descarta formalmente la ejecución de un metaanálisis estadístico de efectos fijos o aleatorios debido a la profunda heterogeneidad técnica, métrica y contextual del dominio de Information Extraction en documentos empresariales: (a) heterogeneidad métrica: los estudios evalúan el rendimiento a niveles de granularidad conceptualmente incompatibles (exactitud de OCR a nivel de carácter/token mediante CER/WER frente a KIE a nivel de entidad semántica completa mediante F1-score estricto vs. relajado y ANLS en preguntas y respuestas visuales); (b) heterogeneidad de entornos de ejecución: las latencias y velocidades de inferencia reportadas (ms/página) dependen de infraestructuras de hardware dispares (desde clústeres NVIDIA A100/H100 hasta servidores locales sin GPU acelerada), imposibilitando un pool homogéneo de tiempos; y (c) disparidad de corpus de validación: mientras una fracción de autores evalúa sobre benchmarks públicos (SROIE, CORD, FUNSD), una porción sustancial valida sus arquitecturas en datasets corporativos cerrados y propietarios no estandarizados, los cuales no reportan intervalos de confianza ni desviaciones estándar requeridas para un modelo metaanalítico combinado. En consecuencia, la síntesis estructurada por preguntas de investigación constituye el enfoque epistemológicamente riguroso y apropiado.</w:t>
       </w:r>
     </w:p>
     <w:p>
@@ -10787,7 +11201,7 @@
               <w:rPr>
                 <w:rFonts w:ascii="Times New Roman" w:hAnsi="Times New Roman"/>
                 <w:b/>
-                <w:sz w:val="15"/>
+                <w:sz w:val="14"/>
               </w:rPr>
               <w:t>Pregunta</w:t>
             </w:r>
@@ -10813,7 +11227,7 @@
               <w:rPr>
                 <w:rFonts w:ascii="Times New Roman" w:hAnsi="Times New Roman"/>
                 <w:b/>
-                <w:sz w:val="15"/>
+                <w:sz w:val="14"/>
               </w:rPr>
               <w:t>Contenido Temático a Responder</w:t>
             </w:r>
@@ -10839,7 +11253,7 @@
               <w:rPr>
                 <w:rFonts w:ascii="Times New Roman" w:hAnsi="Times New Roman"/>
                 <w:b/>
-                <w:sz w:val="15"/>
+                <w:sz w:val="14"/>
               </w:rPr>
               <w:t>Tabla de Evidencia Asignada</w:t>
             </w:r>
@@ -10865,7 +11279,7 @@
               <w:rPr>
                 <w:rFonts w:ascii="Times New Roman" w:hAnsi="Times New Roman"/>
                 <w:b/>
-                <w:sz w:val="15"/>
+                <w:sz w:val="14"/>
               </w:rPr>
               <w:t>Gráfico Asignado</w:t>
             </w:r>
@@ -10894,7 +11308,7 @@
             <w:r>
               <w:rPr>
                 <w:rFonts w:ascii="Times New Roman" w:hAnsi="Times New Roman"/>
-                <w:sz w:val="15"/>
+                <w:sz w:val="14"/>
               </w:rPr>
               <w:t>PD1</w:t>
             </w:r>
@@ -10918,7 +11332,7 @@
             <w:r>
               <w:rPr>
                 <w:rFonts w:ascii="Times New Roman" w:hAnsi="Times New Roman"/>
-                <w:sz w:val="15"/>
+                <w:sz w:val="14"/>
               </w:rPr>
               <w:t>Evolución temporal de publicaciones sobre IA/IDP en documentos empresariales.</w:t>
             </w:r>
@@ -10942,7 +11356,7 @@
             <w:r>
               <w:rPr>
                 <w:rFonts w:ascii="Times New Roman" w:hAnsi="Times New Roman"/>
-                <w:sz w:val="15"/>
+                <w:sz w:val="14"/>
               </w:rPr>
               <w:t>Distribución anual de artículos (2020–2025).</w:t>
             </w:r>
@@ -10966,7 +11380,7 @@
             <w:r>
               <w:rPr>
                 <w:rFonts w:ascii="Times New Roman" w:hAnsi="Times New Roman"/>
-                <w:sz w:val="15"/>
+                <w:sz w:val="14"/>
               </w:rPr>
               <w:t>Gráfico de líneas de tendencia temporal.</w:t>
             </w:r>
@@ -10995,7 +11409,7 @@
             <w:r>
               <w:rPr>
                 <w:rFonts w:ascii="Times New Roman" w:hAnsi="Times New Roman"/>
-                <w:sz w:val="15"/>
+                <w:sz w:val="14"/>
               </w:rPr>
               <w:t>PD2</w:t>
             </w:r>
@@ -11019,7 +11433,7 @@
             <w:r>
               <w:rPr>
                 <w:rFonts w:ascii="Times New Roman" w:hAnsi="Times New Roman"/>
-                <w:sz w:val="15"/>
+                <w:sz w:val="14"/>
               </w:rPr>
               <w:t>Productividad académica por autores, revistas indexadas y países líderes.</w:t>
             </w:r>
@@ -11043,9 +11457,9 @@
             <w:r>
               <w:rPr>
                 <w:rFonts w:ascii="Times New Roman" w:hAnsi="Times New Roman"/>
-                <w:sz w:val="15"/>
-              </w:rPr>
-              <w:t>Ranking de las 10 revistas líderes y países.</w:t>
+                <w:sz w:val="14"/>
+              </w:rPr>
+              <w:t>Ranking de las 10 revistas líderes, autores prolíficos y países.</w:t>
             </w:r>
           </w:p>
         </w:tc>
@@ -11067,9 +11481,9 @@
             <w:r>
               <w:rPr>
                 <w:rFonts w:ascii="Times New Roman" w:hAnsi="Times New Roman"/>
-                <w:sz w:val="15"/>
-              </w:rPr>
-              <w:t>Gráfico de barras horizontales geográfico.</w:t>
+                <w:sz w:val="14"/>
+              </w:rPr>
+              <w:t>Gráfico de barras geográfico y red de coocurrencia de palabras clave en VOSviewer.</w:t>
             </w:r>
           </w:p>
         </w:tc>
@@ -11096,7 +11510,7 @@
             <w:r>
               <w:rPr>
                 <w:rFonts w:ascii="Times New Roman" w:hAnsi="Times New Roman"/>
-                <w:sz w:val="15"/>
+                <w:sz w:val="14"/>
               </w:rPr>
               <w:t>PD3</w:t>
             </w:r>
@@ -11120,7 +11534,7 @@
             <w:r>
               <w:rPr>
                 <w:rFonts w:ascii="Times New Roman" w:hAnsi="Times New Roman"/>
-                <w:sz w:val="15"/>
+                <w:sz w:val="14"/>
               </w:rPr>
               <w:t>Distribución de diseños metodológicos y datasets (públicos vs. privados).</w:t>
             </w:r>
@@ -11144,9 +11558,9 @@
             <w:r>
               <w:rPr>
                 <w:rFonts w:ascii="Times New Roman" w:hAnsi="Times New Roman"/>
-                <w:sz w:val="15"/>
-              </w:rPr>
-              <w:t>Tabla cruzada: diseño × tipo de dataset.</w:t>
+                <w:sz w:val="14"/>
+              </w:rPr>
+              <w:t>Tabla cruzada: diseño metodológico × tipo de dataset.</w:t>
             </w:r>
           </w:p>
         </w:tc>
@@ -11168,9 +11582,9 @@
             <w:r>
               <w:rPr>
                 <w:rFonts w:ascii="Times New Roman" w:hAnsi="Times New Roman"/>
-                <w:sz w:val="15"/>
-              </w:rPr>
-              <w:t>Gráfico de barras apiladas de validación.</w:t>
+                <w:sz w:val="14"/>
+              </w:rPr>
+              <w:t>Gráfico de burbujas (mapeo sistemático de Petersen et al. [138]).</w:t>
             </w:r>
           </w:p>
         </w:tc>
@@ -11197,7 +11611,7 @@
             <w:r>
               <w:rPr>
                 <w:rFonts w:ascii="Times New Roman" w:hAnsi="Times New Roman"/>
-                <w:sz w:val="15"/>
+                <w:sz w:val="14"/>
               </w:rPr>
               <w:t>PI1</w:t>
             </w:r>
@@ -11221,7 +11635,7 @@
             <w:r>
               <w:rPr>
                 <w:rFonts w:ascii="Times New Roman" w:hAnsi="Times New Roman"/>
-                <w:sz w:val="15"/>
+                <w:sz w:val="14"/>
               </w:rPr>
               <w:t>Taxonomía de enfoques algorítmicos (secuencias, grafos, transformers multimodales).</w:t>
             </w:r>
@@ -11245,7 +11659,7 @@
             <w:r>
               <w:rPr>
                 <w:rFonts w:ascii="Times New Roman" w:hAnsi="Times New Roman"/>
-                <w:sz w:val="15"/>
+                <w:sz w:val="14"/>
               </w:rPr>
               <w:t>Matriz de arquitecturas de IA identificadas.</w:t>
             </w:r>
@@ -11269,9 +11683,9 @@
             <w:r>
               <w:rPr>
                 <w:rFonts w:ascii="Times New Roman" w:hAnsi="Times New Roman"/>
-                <w:sz w:val="15"/>
-              </w:rPr>
-              <w:t>Gráfico de barras por familia algorítmica.</w:t>
+                <w:sz w:val="14"/>
+              </w:rPr>
+              <w:t>Gráfico de barras por familia algorítmica (síntesis temática [134], [135]).</w:t>
             </w:r>
           </w:p>
         </w:tc>
@@ -11298,7 +11712,7 @@
             <w:r>
               <w:rPr>
                 <w:rFonts w:ascii="Times New Roman" w:hAnsi="Times New Roman"/>
-                <w:sz w:val="15"/>
+                <w:sz w:val="14"/>
               </w:rPr>
               <w:t>PI2</w:t>
             </w:r>
@@ -11322,7 +11736,7 @@
             <w:r>
               <w:rPr>
                 <w:rFonts w:ascii="Times New Roman" w:hAnsi="Times New Roman"/>
-                <w:sz w:val="15"/>
+                <w:sz w:val="14"/>
               </w:rPr>
               <w:t>Rendimiento cuantitativo reportado (F1-score, exactitud, latencia de inferencia).</w:t>
             </w:r>
@@ -11346,9 +11760,9 @@
             <w:r>
               <w:rPr>
                 <w:rFonts w:ascii="Times New Roman" w:hAnsi="Times New Roman"/>
-                <w:sz w:val="15"/>
-              </w:rPr>
-              <w:t>Tabla comparativa de métricas estadísticas.</w:t>
+                <w:sz w:val="14"/>
+              </w:rPr>
+              <w:t>Tabla comparativa de métricas por benchmark (SROIE, FUNSD, CORD).</w:t>
             </w:r>
           </w:p>
         </w:tc>
@@ -11370,9 +11784,9 @@
             <w:r>
               <w:rPr>
                 <w:rFonts w:ascii="Times New Roman" w:hAnsi="Times New Roman"/>
-                <w:sz w:val="15"/>
-              </w:rPr>
-              <w:t>Diagrama de cajas y bigotes (boxplot).</w:t>
+                <w:sz w:val="14"/>
+              </w:rPr>
+              <w:t>Síntesis narrativa estructurada (Popay et al. [136]) con rangos [mín, máx] y dispersión.</w:t>
             </w:r>
           </w:p>
         </w:tc>
@@ -11399,7 +11813,7 @@
             <w:r>
               <w:rPr>
                 <w:rFonts w:ascii="Times New Roman" w:hAnsi="Times New Roman"/>
-                <w:sz w:val="15"/>
+                <w:sz w:val="14"/>
               </w:rPr>
               <w:t>PI3</w:t>
             </w:r>
@@ -11423,7 +11837,7 @@
             <w:r>
               <w:rPr>
                 <w:rFonts w:ascii="Times New Roman" w:hAnsi="Times New Roman"/>
-                <w:sz w:val="15"/>
+                <w:sz w:val="14"/>
               </w:rPr>
               <w:t>Comparativa de eficiencia y costo: IA/IDP frente a ingreso manual y reglas.</w:t>
             </w:r>
@@ -11447,9 +11861,9 @@
             <w:r>
               <w:rPr>
                 <w:rFonts w:ascii="Times New Roman" w:hAnsi="Times New Roman"/>
-                <w:sz w:val="15"/>
-              </w:rPr>
-              <w:t>Ganancia en velocidad y reducción de error.</w:t>
+                <w:sz w:val="14"/>
+              </w:rPr>
+              <w:t>Conteo de votos de dirección del efecto (mejora, sin diferencia, empeora).</w:t>
             </w:r>
           </w:p>
         </w:tc>
@@ -11471,9 +11885,9 @@
             <w:r>
               <w:rPr>
                 <w:rFonts w:ascii="Times New Roman" w:hAnsi="Times New Roman"/>
-                <w:sz w:val="15"/>
-              </w:rPr>
-              <w:t>Gráfico comparativo: Tradicional vs. IA.</w:t>
+                <w:sz w:val="14"/>
+              </w:rPr>
+              <w:t>Método SWiM (Campbell et al. [137]) con gráfico de barras divergentes.</w:t>
             </w:r>
           </w:p>
         </w:tc>
@@ -11500,7 +11914,7 @@
             <w:r>
               <w:rPr>
                 <w:rFonts w:ascii="Times New Roman" w:hAnsi="Times New Roman"/>
-                <w:sz w:val="15"/>
+                <w:sz w:val="14"/>
               </w:rPr>
               <w:t>PI4</w:t>
             </w:r>
@@ -11524,7 +11938,7 @@
             <w:r>
               <w:rPr>
                 <w:rFonts w:ascii="Times New Roman" w:hAnsi="Times New Roman"/>
-                <w:sz w:val="15"/>
+                <w:sz w:val="14"/>
               </w:rPr>
               <w:t>Tipologías documentales (facturas, recibos) y sistemas ERP/CRM integrados.</w:t>
             </w:r>
@@ -11548,7 +11962,7 @@
             <w:r>
               <w:rPr>
                 <w:rFonts w:ascii="Times New Roman" w:hAnsi="Times New Roman"/>
-                <w:sz w:val="15"/>
+                <w:sz w:val="14"/>
               </w:rPr>
               <w:t>Frecuencia por tipo de documento × plataforma.</w:t>
             </w:r>
@@ -11572,7 +11986,7 @@
             <w:r>
               <w:rPr>
                 <w:rFonts w:ascii="Times New Roman" w:hAnsi="Times New Roman"/>
-                <w:sz w:val="15"/>
+                <w:sz w:val="14"/>
               </w:rPr>
               <w:t>Matriz de calor (heatmap) documental.</w:t>
             </w:r>
@@ -12689,7 +13103,7 @@
         <w:rPr>
           <w:sz w:val="16"/>
         </w:rPr>
-        <w:t>Jia M.; Yu W.; Ma K.; Fang T.; Li C., "Leopard: A Vision Language Model for Text-Rich Multi-Image Tasks," Transactions on Machine Learning Research, 2025, doi: 10.48550/arxiv.2410.01744.</w:t>
+        <w:t>Jia M.; Yu W.; Ma K.; Fang T.; Li C., "Leopard: A Vision Language Model for Text-Rich Multi-Image Tasks," Transactions on Machine Learning Research, 2025, ISSN: 2835-8856. [Online]. Available: https://jmlr.org/tmlr/papers/.</w:t>
       </w:r>
     </w:p>
     <w:p>
@@ -13389,7 +13803,7 @@
         <w:rPr>
           <w:sz w:val="16"/>
         </w:rPr>
-        <w:t>Gbada H.; Kalti K.; Mahjoub M.A., "Deep learning approaches for information extraction from visually rich documents: datasets, challenges and methods," International Journal on Document Analysis and Recognition, 2025, doi: 10.1007/s10032-024-00493-8.</w:t>
+        <w:t>Nguyen M.-T.; Son N.H.; Linh L.T., "Gain more with less: Extracting information from business documents with small data," Expert Systems with Applications, 2023, doi: 10.1016/j.eswa.2022.119274.</w:t>
       </w:r>
     </w:p>
     <w:p>
@@ -14369,7 +14783,7 @@
         <w:rPr>
           <w:sz w:val="16"/>
         </w:rPr>
-        <w:t>Tobaben M.; Souibgui M.A.; Tito R.; Nguyen K.; Kerkouche R.; Jung K.; Jälkö J.; Kang L.; Barsky A.; D’andecy V.P.; Joseph A.; Muhamed A.; Kuo K.; Smith V.; Yamasaki Y.; Fukami T.; Niwa K.; Tyou I.; Ishii H.; Yokota R.; Ragul N.; Kutum R.; Llados J.; Valveny E.; Honkela A.; Fritz M.; Karatzas D., "NeurIPS 2023 Competition: Privacy Preserving Federated Learning Document VQA," Transactions on Machine Learning Research, 2025.</w:t>
+        <w:t>Tobaben M.; Souibgui M.A.; Tito R.; Nguyen K.; Kerkouche R.; Jung K.; Jälkö J.; Kang L.; Barsky A.; D’andecy V.P.; Joseph A.; Muhamed A.; Kuo K.; Smith V.; Yamasaki Y.; Fukami T.; Niwa K.; Tyou I.; Ishii H.; Yokota R.; Ragul N.; Kutum R.; Llados J.; Valveny E.; Honkela A.; Fritz M.; Karatzas D., "NeurIPS 2023 Competition: Privacy Preserving Federated Learning Document VQA," Transactions on Machine Learning Research, 2025, ISSN: 2835-8856. [Online]. Available: https://jmlr.org/tmlr/papers/.</w:t>
       </w:r>
     </w:p>
     <w:p>
@@ -14710,6 +15124,146 @@
           <w:sz w:val="16"/>
         </w:rPr>
         <w:t>Gonçalves M.J.A.; da Silva A.C.F.; Ferreira C.G., "The Future of Accounting: How Will Digital Transformation Impact the Sector?," Informatics, 2022, doi: 10.3390/informatics9010019.</w:t>
+      </w:r>
+    </w:p>
+    <w:p>
+      <w:pPr>
+        <w:spacing w:line="240" w:lineRule="auto" w:before="0" w:after="40"/>
+        <w:ind w:left="432" w:hanging="432"/>
+        <w:jc w:val="both"/>
+      </w:pPr>
+      <w:r>
+        <w:rPr>
+          <w:b/>
+          <w:sz w:val="16"/>
+        </w:rPr>
+        <w:t xml:space="preserve">[134] </w:t>
+      </w:r>
+      <w:r>
+        <w:rPr>
+          <w:sz w:val="16"/>
+        </w:rPr>
+        <w:t>J. Thomas and A. Harden, 'Methods for the thematic synthesis of qualitative research in systematic reviews,' BMC Med. Res. Methodol., vol. 8, art. 45, 2008, doi: 10.1186/1471-2288-8-45.</w:t>
+      </w:r>
+    </w:p>
+    <w:p>
+      <w:pPr>
+        <w:spacing w:line="240" w:lineRule="auto" w:before="0" w:after="40"/>
+        <w:ind w:left="432" w:hanging="432"/>
+        <w:jc w:val="both"/>
+      </w:pPr>
+      <w:r>
+        <w:rPr>
+          <w:b/>
+          <w:sz w:val="16"/>
+        </w:rPr>
+        <w:t xml:space="preserve">[135] </w:t>
+      </w:r>
+      <w:r>
+        <w:rPr>
+          <w:sz w:val="16"/>
+        </w:rPr>
+        <w:t>D. S. Cruzes and T. Dybå, 'Research synthesis in software engineering: A tertiary study,' Inf. Softw. Technol., vol. 53, no. 5, pp. 440–455, 2011, doi: 10.1016/j.infsof.2011.01.004.</w:t>
+      </w:r>
+    </w:p>
+    <w:p>
+      <w:pPr>
+        <w:spacing w:line="240" w:lineRule="auto" w:before="0" w:after="40"/>
+        <w:ind w:left="432" w:hanging="432"/>
+        <w:jc w:val="both"/>
+      </w:pPr>
+      <w:r>
+        <w:rPr>
+          <w:b/>
+          <w:sz w:val="16"/>
+        </w:rPr>
+        <w:t xml:space="preserve">[136] </w:t>
+      </w:r>
+      <w:r>
+        <w:rPr>
+          <w:sz w:val="16"/>
+        </w:rPr>
+        <w:t>J. Popay et al., 'Guidance on the conduct of narrative synthesis in systematic reviews,' ESRC Methods Programme, Lancaster Univ., 2006.</w:t>
+      </w:r>
+    </w:p>
+    <w:p>
+      <w:pPr>
+        <w:spacing w:line="240" w:lineRule="auto" w:before="0" w:after="40"/>
+        <w:ind w:left="432" w:hanging="432"/>
+        <w:jc w:val="both"/>
+      </w:pPr>
+      <w:r>
+        <w:rPr>
+          <w:b/>
+          <w:sz w:val="16"/>
+        </w:rPr>
+        <w:t xml:space="preserve">[137] </w:t>
+      </w:r>
+      <w:r>
+        <w:rPr>
+          <w:sz w:val="16"/>
+        </w:rPr>
+        <w:t>M. Campbell et al., 'Synthesis without meta-analysis (SWiM) in systematic reviews: Reporting guideline,' BMJ, vol. 368, p. l6890, 2020, doi: 10.1136/bmj.l6890.</w:t>
+      </w:r>
+    </w:p>
+    <w:p>
+      <w:pPr>
+        <w:spacing w:line="240" w:lineRule="auto" w:before="0" w:after="40"/>
+        <w:ind w:left="432" w:hanging="432"/>
+        <w:jc w:val="both"/>
+      </w:pPr>
+      <w:r>
+        <w:rPr>
+          <w:b/>
+          <w:sz w:val="16"/>
+        </w:rPr>
+        <w:t xml:space="preserve">[138] </w:t>
+      </w:r>
+      <w:r>
+        <w:rPr>
+          <w:sz w:val="16"/>
+        </w:rPr>
+        <w:t>K. Petersen, S. Vakkalanka, and L. Kuzniarz, 'Guidelines for conducting systematic mapping studies in software engineering: An update,' Inf. Softw. Technol., vol. 64, pp. 1–18, 2015, doi: 10.1016/j.infsof.2015.03.007.</w:t>
+      </w:r>
+    </w:p>
+    <w:p>
+      <w:pPr>
+        <w:spacing w:line="240" w:lineRule="auto" w:before="0" w:after="40"/>
+        <w:ind w:left="432" w:hanging="432"/>
+        <w:jc w:val="both"/>
+      </w:pPr>
+      <w:r>
+        <w:rPr>
+          <w:b/>
+          <w:sz w:val="16"/>
+        </w:rPr>
+        <w:t xml:space="preserve">[139] </w:t>
+      </w:r>
+      <w:r>
+        <w:rPr>
+          <w:sz w:val="16"/>
+        </w:rPr>
+        <w:t>N. J. van Eck and L. Waltman, 'Software survey: VOSviewer, a computer program for bibliometric mapping,' Scientometrics, vol. 84, no. 2, pp. 523–538, 2010, doi: 10.1007/s11192-009-0146-3.</w:t>
+      </w:r>
+    </w:p>
+    <w:p>
+      <w:pPr>
+        <w:spacing w:line="240" w:lineRule="auto" w:before="0" w:after="40"/>
+        <w:ind w:left="432" w:hanging="432"/>
+        <w:jc w:val="both"/>
+      </w:pPr>
+      <w:r>
+        <w:rPr>
+          <w:b/>
+          <w:sz w:val="16"/>
+        </w:rPr>
+        <w:t xml:space="preserve">[140] </w:t>
+      </w:r>
+      <w:r>
+        <w:rPr>
+          <w:sz w:val="16"/>
+        </w:rPr>
+        <w:t>S. Lewin et al., 'Applying GRADE-CERQual to qualitative evidence synthesis findings: Introduction to the series,' Implement. Sci., vol. 13, suppl. 1, art. 2, 2018, doi: 10.1186/s13012-017-0688-3.</w:t>
       </w:r>
     </w:p>
     <w:sectPr>

</xml_diff>